<commit_message>
Major revision of all documents with new analysis approach.
</commit_message>
<xml_diff>
--- a/submission/current zoology/2025_earwig_fecundity_edited.docx
+++ b/submission/current zoology/2025_earwig_fecundity_edited.docx
@@ -160,14 +160,71 @@
         <w:t>F. auricularia</w:t>
       </w:r>
       <w:r>
-        <w:t xml:space="preserve"> is an ideal insect for testing this hypothesis because females lay a single clutch of eggs in a subterranean burrow within a short period of time (i.e. hours) (Meunier 2024). Females care for eggs and the nymphs for up to 2 weeks post-hatching (Staerkle and Kölliker 2008; Meunier 2024). Earwigs in Quebec, Canada, are semelparous because the harsh environmental conditions extend the incubation and egg-care period beyond the point at which a second clutch is possible (Tourneur 2018). However, females can be induced to lay a second clutch under optimal laboratory conditions. I use this system to test the prediction that if resource allocation to clutches is greater among than within individuals, then the phenotypic and among-individual correlations between egg size and number will be positive, but the within-individual correlation will be negative because individual females trade off egg number for size. Second, I compare the average number and size of eggs across clutches to test whether fitness gains are optimised at a specific egg quantity or quality (e.g., Smith and Fretwell 1974). If so, one trait should not differ between clutches (e.g., egg number), whereas the other (e.g., egg size) is adjusted accordingly (Winkler and Wallin 1987). Alternatively, females laying a second clutch may recognise their low residual reproductive value and, consequently, terminally invest in current reproduction by producing either more or larger eggs in this clutch (Clutton-Brock 1984). Finally, I explore whether eggs in first and second clutches differ in their size variation at the among- and within-female (clutch) levels (e.g. Hargitai et al. 2005).</w:t>
+        <w:t xml:space="preserve"> is an ideal insect for testing this hypothesis because females lay a </w:t>
+      </w:r>
+      <w:del w:id="2" w:author="Kelly, Clint Dale" w:date="2026-02-12T16:27:00Z" w16du:dateUtc="2026-02-12T21:27:00Z">
+        <w:r>
+          <w:delText xml:space="preserve">single </w:delText>
+        </w:r>
+      </w:del>
+      <w:r>
+        <w:t>clutch of eggs in a subterranean burrow within a short period of time (i.e. hours) (Meunier 2024)</w:t>
+      </w:r>
+      <w:ins w:id="3" w:author="Kelly, Clint Dale" w:date="2026-02-12T16:29:00Z" w16du:dateUtc="2026-02-12T21:29:00Z">
+        <w:r>
+          <w:t xml:space="preserve">, but it </w:t>
+        </w:r>
+        <w:proofErr w:type="spellStart"/>
+        <w:r>
+          <w:t>is</w:t>
+        </w:r>
+      </w:ins>
+      <w:del w:id="4" w:author="Kelly, Clint Dale" w:date="2026-02-12T16:29:00Z" w16du:dateUtc="2026-02-12T21:29:00Z">
+        <w:r>
+          <w:delText xml:space="preserve">. </w:delText>
+        </w:r>
+      </w:del>
+      <w:ins w:id="5" w:author="Kelly, Clint Dale" w:date="2026-02-12T16:28:00Z" w16du:dateUtc="2026-02-12T21:28:00Z">
+        <w:r>
+          <w:t>not</w:t>
+        </w:r>
+        <w:proofErr w:type="spellEnd"/>
+        <w:r>
+          <w:t xml:space="preserve"> clear whether females trade</w:t>
+        </w:r>
+      </w:ins>
+      <w:ins w:id="6" w:author="Kelly, Clint Dale" w:date="2026-02-12T16:29:00Z" w16du:dateUtc="2026-02-12T21:29:00Z">
+        <w:r>
+          <w:t xml:space="preserve"> </w:t>
+        </w:r>
+      </w:ins>
+      <w:ins w:id="7" w:author="Kelly, Clint Dale" w:date="2026-02-12T16:28:00Z" w16du:dateUtc="2026-02-12T21:28:00Z">
+        <w:r>
+          <w:t xml:space="preserve">off clutch and egg size </w:t>
+        </w:r>
+      </w:ins>
+      <w:ins w:id="8" w:author="Kelly, Clint Dale" w:date="2026-02-12T16:29:00Z" w16du:dateUtc="2026-02-12T21:29:00Z">
+        <w:r>
+          <w:t xml:space="preserve">across multiple clutches </w:t>
+        </w:r>
+      </w:ins>
+      <w:ins w:id="9" w:author="Kelly, Clint Dale" w:date="2026-02-12T16:28:00Z" w16du:dateUtc="2026-02-12T21:28:00Z">
+        <w:r>
+          <w:t>[@koch2014]</w:t>
+        </w:r>
+        <w:r>
+          <w:t xml:space="preserve">. </w:t>
+        </w:r>
+      </w:ins>
+      <w:r>
+        <w:t>Females care for eggs and the nymphs for up to 2 weeks post-hatching (Staerkle and Kölliker 2008; Meunier 2024). Earwigs in Quebec, Canada, are semelparous because the harsh environmental conditions extend the incubation and egg-care period beyond the point at which a second clutch is possible (Tourneur 2018). However, females can be induced to lay a second clutch under optimal laboratory conditions. I use this system to test the prediction that if resource allocation to clutches is greater among than within individuals, then the phenotypic and among-individual correlations between egg size and number will be positive, but the within-individual correlation will be negative because individual females trade off egg number for size. Second, I compare the average number and size of eggs across clutches to test whether fitness gains are optimised at a specific egg quantity or quality (e.g., Smith and Fretwell 1974). If so, one trait should not differ between clutches (e.g., egg number), whereas the other (e.g., egg size) is adjusted accordingly (Winkler and Wallin 1987). Alternatively, females laying a second clutch may recognise their low residual reproductive value and, consequently, terminally invest in current reproduction by producing either more or larger eggs in this clutch (Clutton-Brock 1984). Finally, I explore whether eggs in first and second clutches differ in their size variation at the among- and within-female (clutch) levels (e.g. Hargitai et al. 2005).</w:t>
       </w:r>
     </w:p>
     <w:p>
       <w:pPr>
         <w:pStyle w:val="Heading1"/>
       </w:pPr>
-      <w:bookmarkStart w:id="2" w:name="methods"/>
+      <w:bookmarkStart w:id="10" w:name="methods"/>
       <w:bookmarkEnd w:id="1"/>
       <w:r>
         <w:lastRenderedPageBreak/>
@@ -206,7 +263,7 @@
       <w:pPr>
         <w:pStyle w:val="Heading3"/>
       </w:pPr>
-      <w:bookmarkStart w:id="3" w:name="statistical-analysis"/>
+      <w:bookmarkStart w:id="11" w:name="statistical-analysis"/>
       <w:r>
         <w:t>Statistical analysis</w:t>
       </w:r>
@@ -226,7 +283,20 @@
         <w:t>rptR</w:t>
       </w:r>
       <w:r>
-        <w:t xml:space="preserve"> (Stoffel et al. 2017). I entered the trait of interest as the response variable, female ID as a random effect, and assumed a Gaussian distribution. Each analysis was based on 1000 bootstrap samples. Because the measurements of my three traits were highly repeatable (pronotum length: </w:t>
+        <w:t xml:space="preserve"> (Stoffel et al. 2017). I entered the trait of interest as the response variable, female ID as a random effect, and assumed a Gaussian distribution. Each analysis was based on 1000 bootstrap samples. </w:t>
+      </w:r>
+      <w:del w:id="12" w:author="Kelly, Clint Dale" w:date="2026-02-13T08:14:00Z" w16du:dateUtc="2026-02-13T13:14:00Z">
+        <w:r>
+          <w:delText>Because t</w:delText>
+        </w:r>
+      </w:del>
+      <w:ins w:id="13" w:author="Kelly, Clint Dale" w:date="2026-02-13T08:14:00Z" w16du:dateUtc="2026-02-13T13:14:00Z">
+        <w:r>
+          <w:t>T</w:t>
+        </w:r>
+      </w:ins>
+      <w:r>
+        <w:t xml:space="preserve">he measurements of my three traits were highly repeatable (pronotum length: </w:t>
       </w:r>
       <w:r>
         <w:rPr>
@@ -246,7 +316,28 @@
         <w:t>R</w:t>
       </w:r>
       <w:r>
-        <w:t xml:space="preserve"> [95% CI] = 0.99 [0.988, 0.996]; egg perimeter in the first brood: </w:t>
+        <w:t xml:space="preserve"> [95% CI] = 0.99 [0.988, 0.996]; egg perimeter</w:t>
+      </w:r>
+      <w:ins w:id="14" w:author="Kelly, Clint Dale" w:date="2026-02-13T08:13:00Z" w16du:dateUtc="2026-02-13T13:13:00Z">
+        <w:r>
+          <w:t>s</w:t>
+        </w:r>
+      </w:ins>
+      <w:r>
+        <w:t xml:space="preserve"> in the first </w:t>
+      </w:r>
+      <w:del w:id="15" w:author="Kelly, Clint Dale" w:date="2026-02-13T08:30:00Z" w16du:dateUtc="2026-02-13T13:30:00Z">
+        <w:r>
+          <w:delText>brood</w:delText>
+        </w:r>
+      </w:del>
+      <w:ins w:id="16" w:author="Kelly, Clint Dale" w:date="2026-02-13T08:30:00Z" w16du:dateUtc="2026-02-13T13:30:00Z">
+        <w:r>
+          <w:t>clutch</w:t>
+        </w:r>
+      </w:ins>
+      <w:r>
+        <w:t xml:space="preserve">: </w:t>
       </w:r>
       <w:r>
         <w:rPr>
@@ -256,7 +347,20 @@
         <w:t>R</w:t>
       </w:r>
       <w:r>
-        <w:t xml:space="preserve"> [95% CI] = 0.977 [0.976, 0.979] and in the second brood: </w:t>
+        <w:t xml:space="preserve"> [95% CI] = 0.977 [0.976, 0.979] and in the second </w:t>
+      </w:r>
+      <w:del w:id="17" w:author="Kelly, Clint Dale" w:date="2026-02-13T08:30:00Z" w16du:dateUtc="2026-02-13T13:30:00Z">
+        <w:r>
+          <w:delText>brood</w:delText>
+        </w:r>
+      </w:del>
+      <w:ins w:id="18" w:author="Kelly, Clint Dale" w:date="2026-02-13T08:30:00Z" w16du:dateUtc="2026-02-13T13:30:00Z">
+        <w:r>
+          <w:t>clutch</w:t>
+        </w:r>
+      </w:ins>
+      <w:r>
+        <w:t xml:space="preserve">: </w:t>
       </w:r>
       <w:r>
         <w:rPr>
@@ -266,8 +370,127 @@
         <w:t>R</w:t>
       </w:r>
       <w:r>
-        <w:t xml:space="preserve"> [95% CI] = 0.93 [0.926, 0.937] ). I used each female’s mean value for each trait in all subsequent analyses.</w:t>
-      </w:r>
+        <w:t xml:space="preserve"> [95% CI] = 0.93 [0.926, 0.937] ). I </w:t>
+      </w:r>
+      <w:ins w:id="19" w:author="Kelly, Clint Dale" w:date="2026-02-13T08:14:00Z" w16du:dateUtc="2026-02-13T13:14:00Z">
+        <w:r>
+          <w:t xml:space="preserve">therefore used </w:t>
+        </w:r>
+      </w:ins>
+      <w:del w:id="20" w:author="Kelly, Clint Dale" w:date="2026-02-13T08:15:00Z" w16du:dateUtc="2026-02-13T13:15:00Z">
+        <w:r>
+          <w:delText xml:space="preserve">used </w:delText>
+        </w:r>
+      </w:del>
+      <w:r>
+        <w:t xml:space="preserve">each female’s mean </w:t>
+      </w:r>
+      <w:del w:id="21" w:author="Kelly, Clint Dale" w:date="2026-02-13T08:15:00Z" w16du:dateUtc="2026-02-13T13:15:00Z">
+        <w:r>
+          <w:delText>value</w:delText>
+        </w:r>
+      </w:del>
+      <w:ins w:id="22" w:author="Kelly, Clint Dale" w:date="2026-02-13T08:15:00Z" w16du:dateUtc="2026-02-13T13:15:00Z">
+        <w:r>
+          <w:t>pronotum</w:t>
+        </w:r>
+      </w:ins>
+      <w:r>
+        <w:t xml:space="preserve"> </w:t>
+      </w:r>
+      <w:del w:id="23" w:author="Kelly, Clint Dale" w:date="2026-02-13T08:15:00Z" w16du:dateUtc="2026-02-13T13:15:00Z">
+        <w:r>
+          <w:delText>for</w:delText>
+        </w:r>
+      </w:del>
+      <w:proofErr w:type="spellStart"/>
+      <w:ins w:id="24" w:author="Kelly, Clint Dale" w:date="2026-02-13T08:15:00Z" w16du:dateUtc="2026-02-13T13:15:00Z">
+        <w:r>
+          <w:t>length</w:t>
+        </w:r>
+      </w:ins>
+      <w:del w:id="25" w:author="Kelly, Clint Dale" w:date="2026-02-13T08:15:00Z" w16du:dateUtc="2026-02-13T13:15:00Z">
+        <w:r>
+          <w:delText xml:space="preserve"> each</w:delText>
+        </w:r>
+      </w:del>
+      <w:ins w:id="26" w:author="Kelly, Clint Dale" w:date="2026-02-13T08:15:00Z" w16du:dateUtc="2026-02-13T13:15:00Z">
+        <w:r>
+          <w:t>and</w:t>
+        </w:r>
+        <w:proofErr w:type="spellEnd"/>
+        <w:r>
+          <w:t xml:space="preserve"> body</w:t>
+        </w:r>
+      </w:ins>
+      <w:r>
+        <w:t xml:space="preserve"> </w:t>
+      </w:r>
+      <w:del w:id="27" w:author="Kelly, Clint Dale" w:date="2026-02-13T08:15:00Z" w16du:dateUtc="2026-02-13T13:15:00Z">
+        <w:r>
+          <w:delText>trait</w:delText>
+        </w:r>
+      </w:del>
+      <w:ins w:id="28" w:author="Kelly, Clint Dale" w:date="2026-02-13T08:15:00Z" w16du:dateUtc="2026-02-13T13:15:00Z">
+        <w:r>
+          <w:t>mass</w:t>
+        </w:r>
+      </w:ins>
+      <w:ins w:id="29" w:author="Kelly, Clint Dale" w:date="2026-02-13T08:17:00Z" w16du:dateUtc="2026-02-13T13:17:00Z">
+        <w:r>
+          <w:t xml:space="preserve">, in addition to </w:t>
+        </w:r>
+        <w:r>
+          <w:t>the mean egg perimeter for each egg</w:t>
+        </w:r>
+        <w:r>
+          <w:t>,</w:t>
+        </w:r>
+      </w:ins>
+      <w:r>
+        <w:t xml:space="preserve"> in all subsequent analyses.</w:t>
+      </w:r>
+      <w:ins w:id="30" w:author="Kelly, Clint Dale" w:date="2026-02-13T08:15:00Z" w16du:dateUtc="2026-02-13T13:15:00Z">
+        <w:r>
+          <w:t xml:space="preserve"> </w:t>
+        </w:r>
+      </w:ins>
+      <w:ins w:id="31" w:author="Kelly, Clint Dale" w:date="2026-02-13T08:30:00Z" w16du:dateUtc="2026-02-13T13:30:00Z">
+        <w:r>
+          <w:t>The final data set comprised 42 females</w:t>
+        </w:r>
+      </w:ins>
+      <w:ins w:id="32" w:author="Kelly, Clint Dale" w:date="2026-02-13T08:34:00Z" w16du:dateUtc="2026-02-13T13:34:00Z">
+        <w:r>
+          <w:t>,</w:t>
+        </w:r>
+      </w:ins>
+      <w:ins w:id="33" w:author="Kelly, Clint Dale" w:date="2026-02-13T08:30:00Z" w16du:dateUtc="2026-02-13T13:30:00Z">
+        <w:r>
+          <w:t xml:space="preserve"> each </w:t>
+        </w:r>
+      </w:ins>
+      <w:ins w:id="34" w:author="Kelly, Clint Dale" w:date="2026-02-13T08:35:00Z" w16du:dateUtc="2026-02-13T13:35:00Z">
+        <w:r>
+          <w:t xml:space="preserve">with two clutches: on average, </w:t>
+        </w:r>
+        <w:r>
+          <w:t>xx</w:t>
+        </w:r>
+        <w:r>
+          <w:t xml:space="preserve"> eggs in the first clutch and xxx eggs in the second; the total number of egg-size</w:t>
+        </w:r>
+      </w:ins>
+      <w:ins w:id="35" w:author="Kelly, Clint Dale" w:date="2026-02-13T08:34:00Z" w16du:dateUtc="2026-02-13T13:34:00Z">
+        <w:r>
+          <w:t xml:space="preserve"> measurements included in the analysis was 3599.</w:t>
+        </w:r>
+      </w:ins>
+      <w:ins w:id="36" w:author="Kelly, Clint Dale" w:date="2026-02-13T08:31:00Z" w16du:dateUtc="2026-02-13T13:31:00Z">
+        <w:r>
+          <w:t xml:space="preserve"> </w:t>
+        </w:r>
+      </w:ins>
     </w:p>
     <w:p>
       <w:pPr>
@@ -292,6 +515,7 @@
         <w:pStyle w:val="BodyText"/>
       </w:pPr>
       <w:r>
+        <w:lastRenderedPageBreak/>
         <w:t>I tested the prediction that egg number and egg size trade off within females using a Bayesian multivariate linear mixed-effects model (</w:t>
       </w:r>
       <w:r>
@@ -328,23 +552,19 @@
         <w:t>within</w:t>
       </w:r>
       <w:r>
-        <w:t xml:space="preserve">) between egg number and egg size. I </w:t>
-      </w:r>
-      <w:r>
-        <w:lastRenderedPageBreak/>
-        <w:t xml:space="preserve">assumed a Gaussian error distribution for both traits to permit the calculation of within-female residuals. Clutch number (first or second) was entered as a fixed effect to test whether the two clutches differed in egg number or egg size. This model also included female </w:t>
-      </w:r>
-      <w:del w:id="4" w:author="Kelly, Clint Dale" w:date="2026-02-10T09:16:00Z" w16du:dateUtc="2026-02-10T14:16:00Z">
+        <w:t xml:space="preserve">) between egg number and egg size. I assumed a Gaussian error distribution for both traits to permit the calculation of within-female residuals. Clutch number (first or second) was entered as a fixed effect to test whether the two clutches differed in egg number or egg size. This model also included female </w:t>
+      </w:r>
+      <w:del w:id="37" w:author="Kelly, Clint Dale" w:date="2026-02-10T09:16:00Z" w16du:dateUtc="2026-02-10T14:16:00Z">
         <w:r>
           <w:delText>scaled mas</w:delText>
         </w:r>
       </w:del>
-      <w:ins w:id="5" w:author="Kelly, Clint Dale" w:date="2026-02-10T09:16:00Z" w16du:dateUtc="2026-02-10T14:16:00Z">
+      <w:ins w:id="38" w:author="Kelly, Clint Dale" w:date="2026-02-10T09:16:00Z" w16du:dateUtc="2026-02-10T14:16:00Z">
         <w:r>
           <w:t>pronotum length, a proxy for body size,</w:t>
         </w:r>
       </w:ins>
-      <w:del w:id="6" w:author="Kelly, Clint Dale" w:date="2026-02-10T09:16:00Z" w16du:dateUtc="2026-02-10T14:16:00Z">
+      <w:del w:id="39" w:author="Kelly, Clint Dale" w:date="2026-02-10T09:16:00Z" w16du:dateUtc="2026-02-10T14:16:00Z">
         <w:r>
           <w:delText>s</w:delText>
         </w:r>
@@ -352,23 +572,148 @@
       <w:r>
         <w:t xml:space="preserve"> as a continuous covariate because body size generally correlates with fecundity in insects (Honek 1993). Female ID was included as a random effect via the term (1|a|id), ensuring that random effects were correlated within each female. I assessed which of the four measures of female body size (pronotum length, body mass, PC1, or scaled mass) provided the greatest explanatory power by running </w:t>
       </w:r>
-      <w:del w:id="7" w:author="Kelly, Clint Dale" w:date="2026-02-10T09:10:00Z" w16du:dateUtc="2026-02-10T14:10:00Z">
+      <w:del w:id="40" w:author="Kelly, Clint Dale" w:date="2026-02-10T09:10:00Z" w16du:dateUtc="2026-02-10T14:10:00Z">
         <w:r>
           <w:delText xml:space="preserve">three </w:delText>
         </w:r>
       </w:del>
-      <w:ins w:id="8" w:author="Kelly, Clint Dale" w:date="2026-02-10T09:10:00Z" w16du:dateUtc="2026-02-10T14:10:00Z">
-        <w:r>
-          <w:t>four</w:t>
-        </w:r>
+      <w:ins w:id="41" w:author="Kelly, Clint Dale" w:date="2026-02-10T09:10:00Z" w16du:dateUtc="2026-02-10T14:10:00Z">
+        <w:r>
+          <w:t xml:space="preserve">four </w:t>
+        </w:r>
+      </w:ins>
+      <w:r>
+        <w:t>models, each with a different measure, and then comparing them, in addition to a null model without a size measure, using leave-one-out cross-validation (LOO) (Vehtari et al. 2017). Pronotum length, body mass, and scaled mass were scaled (mean = 0, sd = 1) before analysis. The model that included pronotum length as a continuous covariate provided the best fit (Expected Log Predictive Density (ELPD) = -6749.35</w:t>
+      </w:r>
+      <w:ins w:id="42" w:author="Kelly, Clint Dale" w:date="2026-02-13T14:28:00Z" w16du:dateUtc="2026-02-13T19:28:00Z">
+        <w:r>
+          <w:t>; Table S2</w:t>
+        </w:r>
+      </w:ins>
+      <w:r>
+        <w:t xml:space="preserve">). </w:t>
+      </w:r>
+      <w:ins w:id="43" w:author="Kelly, Clint Dale" w:date="2026-02-13T14:31:00Z" w16du:dateUtc="2026-02-13T19:31:00Z">
+        <w:r>
+          <w:t xml:space="preserve">Because </w:t>
+        </w:r>
+      </w:ins>
+      <w:ins w:id="44" w:author="Kelly, Clint Dale" w:date="2026-02-13T14:32:00Z" w16du:dateUtc="2026-02-13T19:32:00Z">
+        <w:r>
+          <w:t>*</w:t>
+        </w:r>
+      </w:ins>
+      <w:ins w:id="45" w:author="Kelly, Clint Dale" w:date="2026-02-13T14:31:00Z" w16du:dateUtc="2026-02-13T19:31:00Z">
+        <w:r>
+          <w:t>brms</w:t>
+        </w:r>
+      </w:ins>
+      <w:ins w:id="46" w:author="Kelly, Clint Dale" w:date="2026-02-13T14:32:00Z" w16du:dateUtc="2026-02-13T19:32:00Z">
+        <w:r>
+          <w:t>*</w:t>
+        </w:r>
+      </w:ins>
+      <w:ins w:id="47" w:author="Kelly, Clint Dale" w:date="2026-02-13T14:31:00Z" w16du:dateUtc="2026-02-13T19:31:00Z">
         <w:r>
           <w:t xml:space="preserve"> </w:t>
         </w:r>
       </w:ins>
-      <w:r>
-        <w:t xml:space="preserve">models, each with a different measure, and then comparing them, in addition to a null model without a size measure, using leave-one-out cross-validation (LOO) (Vehtari et al. 2017). Pronotum length, body mass, and scaled mass were scaled (mean = 0, sd = 1) before analysis. The model that included pronotum length as a continuous covariate provided the best fit (Expected Log Predictive Density (ELPD) = -6749.35). I report the </w:t>
-      </w:r>
-      <w:ins w:id="9" w:author="Kelly, Clint Dale" w:date="2026-02-10T09:17:00Z" w16du:dateUtc="2026-02-10T14:17:00Z">
+      <w:ins w:id="48" w:author="Kelly, Clint Dale" w:date="2026-02-13T14:32:00Z" w16du:dateUtc="2026-02-13T19:32:00Z">
+        <w:r>
+          <w:t>estimates</w:t>
+        </w:r>
+      </w:ins>
+      <w:ins w:id="49" w:author="Kelly, Clint Dale" w:date="2026-02-13T14:31:00Z" w16du:dateUtc="2026-02-13T19:31:00Z">
+        <w:r>
+          <w:t xml:space="preserve"> r</w:t>
+        </w:r>
+        <w:r>
+          <w:t>esidual variation on the log scale</w:t>
+        </w:r>
+      </w:ins>
+      <w:ins w:id="50" w:author="Kelly, Clint Dale" w:date="2026-02-13T14:32:00Z" w16du:dateUtc="2026-02-13T19:32:00Z">
+        <w:r>
+          <w:t xml:space="preserve">, I </w:t>
+        </w:r>
+      </w:ins>
+      <w:proofErr w:type="gramStart"/>
+      <w:ins w:id="51" w:author="Kelly, Clint Dale" w:date="2026-02-13T14:45:00Z" w16du:dateUtc="2026-02-13T19:45:00Z">
+        <w:r>
+          <w:t>back-transformed</w:t>
+        </w:r>
+      </w:ins>
+      <w:proofErr w:type="gramEnd"/>
+      <w:ins w:id="52" w:author="Kelly, Clint Dale" w:date="2026-02-13T14:32:00Z" w16du:dateUtc="2026-02-13T19:32:00Z">
+        <w:r>
+          <w:t xml:space="preserve"> these values for biological interpretation by </w:t>
+        </w:r>
+      </w:ins>
+      <w:ins w:id="53" w:author="Kelly, Clint Dale" w:date="2026-02-13T14:47:00Z" w16du:dateUtc="2026-02-13T19:47:00Z">
+        <w:r>
+          <w:t>exponentiating an</w:t>
+        </w:r>
+        <w:r>
+          <w:t>d</w:t>
+        </w:r>
+        <w:r>
+          <w:t xml:space="preserve"> squaring</w:t>
+        </w:r>
+      </w:ins>
+      <w:ins w:id="54" w:author="Kelly, Clint Dale" w:date="2026-02-13T14:51:00Z" w16du:dateUtc="2026-02-13T19:51:00Z">
+        <w:r>
+          <w:t xml:space="preserve"> them</w:t>
+        </w:r>
+      </w:ins>
+      <w:ins w:id="55" w:author="Kelly, Clint Dale" w:date="2026-02-13T14:49:00Z" w16du:dateUtc="2026-02-13T19:49:00Z">
+        <w:r>
+          <w:t xml:space="preserve">. </w:t>
+        </w:r>
+      </w:ins>
+      <w:ins w:id="56" w:author="Kelly, Clint Dale" w:date="2026-02-13T14:51:00Z" w16du:dateUtc="2026-02-13T19:51:00Z">
+        <w:r>
+          <w:t xml:space="preserve">Standard deviation units of </w:t>
+        </w:r>
+      </w:ins>
+      <w:ins w:id="57" w:author="Kelly, Clint Dale" w:date="2026-02-13T14:50:00Z" w16du:dateUtc="2026-02-13T19:50:00Z">
+        <w:r>
+          <w:t xml:space="preserve">random effects </w:t>
+        </w:r>
+        <w:r>
+          <w:t xml:space="preserve">were squared </w:t>
+        </w:r>
+        <w:r>
+          <w:t xml:space="preserve">to </w:t>
+        </w:r>
+      </w:ins>
+      <w:ins w:id="58" w:author="Kelly, Clint Dale" w:date="2026-02-13T14:51:00Z" w16du:dateUtc="2026-02-13T19:51:00Z">
+        <w:r>
+          <w:t xml:space="preserve">calculate </w:t>
+        </w:r>
+      </w:ins>
+      <w:ins w:id="59" w:author="Kelly, Clint Dale" w:date="2026-02-13T14:52:00Z" w16du:dateUtc="2026-02-13T19:52:00Z">
+        <w:r>
+          <w:t>th</w:t>
+        </w:r>
+      </w:ins>
+      <w:ins w:id="60" w:author="Kelly, Clint Dale" w:date="2026-02-13T14:50:00Z" w16du:dateUtc="2026-02-13T19:50:00Z">
+        <w:r>
+          <w:t>e variances</w:t>
+        </w:r>
+      </w:ins>
+      <w:ins w:id="61" w:author="Kelly, Clint Dale" w:date="2026-02-13T14:51:00Z" w16du:dateUtc="2026-02-13T19:51:00Z">
+        <w:r>
+          <w:t xml:space="preserve">. </w:t>
+        </w:r>
+      </w:ins>
+      <w:ins w:id="62" w:author="Kelly, Clint Dale" w:date="2026-02-13T14:52:00Z" w16du:dateUtc="2026-02-13T19:52:00Z">
+        <w:r>
+          <w:t xml:space="preserve"> </w:t>
+        </w:r>
+      </w:ins>
+      <w:r>
+        <w:t xml:space="preserve">I report the </w:t>
+      </w:r>
+      <w:ins w:id="63" w:author="Kelly, Clint Dale" w:date="2026-02-10T09:17:00Z" w16du:dateUtc="2026-02-10T14:17:00Z">
         <w:r>
           <w:t>phenotypic (</w:t>
         </w:r>
@@ -388,10 +733,7 @@
         </w:r>
         <w:proofErr w:type="spellEnd"/>
         <w:r>
-          <w:t>)</w:t>
-        </w:r>
-        <w:r>
-          <w:t xml:space="preserve">, </w:t>
+          <w:t xml:space="preserve">), </w:t>
         </w:r>
       </w:ins>
       <w:r>
@@ -415,7 +757,7 @@
       <w:r>
         <w:t>)</w:t>
       </w:r>
-      <w:ins w:id="10" w:author="Kelly, Clint Dale" w:date="2026-02-10T09:17:00Z" w16du:dateUtc="2026-02-10T14:17:00Z">
+      <w:ins w:id="64" w:author="Kelly, Clint Dale" w:date="2026-02-10T09:17:00Z" w16du:dateUtc="2026-02-10T14:17:00Z">
         <w:r>
           <w:t>,</w:t>
         </w:r>
@@ -439,7 +781,7 @@
       <w:r>
         <w:t xml:space="preserve">) female correlations and </w:t>
       </w:r>
-      <w:ins w:id="11" w:author="Kelly, Clint Dale" w:date="2026-02-10T09:17:00Z" w16du:dateUtc="2026-02-10T14:17:00Z">
+      <w:ins w:id="65" w:author="Kelly, Clint Dale" w:date="2026-02-10T09:17:00Z" w16du:dateUtc="2026-02-10T14:17:00Z">
         <w:r>
           <w:t xml:space="preserve">their </w:t>
         </w:r>
@@ -447,11 +789,11 @@
       <w:r>
         <w:t>associated 95% credible intervals (CrIs) from the model</w:t>
       </w:r>
-      <w:del w:id="12" w:author="Kelly, Clint Dale" w:date="2026-02-10T09:17:00Z" w16du:dateUtc="2026-02-10T14:17:00Z">
+      <w:del w:id="66" w:author="Kelly, Clint Dale" w:date="2026-02-10T09:17:00Z" w16du:dateUtc="2026-02-10T14:17:00Z">
         <w:r>
           <w:delText xml:space="preserve"> and sum these two values to estimate the </w:delText>
         </w:r>
-        <w:bookmarkStart w:id="13" w:name="OLE_LINK3"/>
+        <w:bookmarkStart w:id="67" w:name="OLE_LINK3"/>
         <w:r>
           <w:delText>phenotypic correlation (</w:delText>
         </w:r>
@@ -471,7 +813,7 @@
         <w:r>
           <w:delText xml:space="preserve">) </w:delText>
         </w:r>
-        <w:bookmarkEnd w:id="13"/>
+        <w:bookmarkEnd w:id="67"/>
         <w:r>
           <w:delText>and its associated 95% CrI</w:delText>
         </w:r>
@@ -487,17 +829,52 @@
       <w:r>
         <w:t xml:space="preserve">I examined whether the first </w:t>
       </w:r>
-      <w:ins w:id="14" w:author="Kelly, Clint Dale" w:date="2026-02-10T14:06:00Z" w16du:dateUtc="2026-02-10T19:06:00Z">
-        <w:r>
-          <w:t xml:space="preserve">(egg number range: ) </w:t>
+      <w:ins w:id="68" w:author="Kelly, Clint Dale" w:date="2026-02-10T14:06:00Z" w16du:dateUtc="2026-02-10T19:06:00Z">
+        <w:r>
+          <w:t xml:space="preserve">(range: </w:t>
+        </w:r>
+      </w:ins>
+      <w:ins w:id="69" w:author="Kelly, Clint Dale" w:date="2026-02-13T14:52:00Z" w16du:dateUtc="2026-02-13T19:52:00Z">
+        <w:r>
+          <w:t>xx -xx</w:t>
+        </w:r>
+      </w:ins>
+      <w:ins w:id="70" w:author="Kelly, Clint Dale" w:date="2026-02-13T08:29:00Z" w16du:dateUtc="2026-02-13T13:29:00Z">
+        <w:r>
+          <w:t xml:space="preserve"> eggs</w:t>
+        </w:r>
+      </w:ins>
+      <w:ins w:id="71" w:author="Kelly, Clint Dale" w:date="2026-02-10T14:06:00Z" w16du:dateUtc="2026-02-10T19:06:00Z">
+        <w:r>
+          <w:t xml:space="preserve">) </w:t>
         </w:r>
       </w:ins>
       <w:r>
         <w:t xml:space="preserve">and second </w:t>
       </w:r>
-      <w:ins w:id="15" w:author="Kelly, Clint Dale" w:date="2026-02-10T14:06:00Z" w16du:dateUtc="2026-02-10T19:06:00Z">
-        <w:r>
-          <w:t>(egg number range: )</w:t>
+      <w:ins w:id="72" w:author="Kelly, Clint Dale" w:date="2026-02-10T14:06:00Z" w16du:dateUtc="2026-02-10T19:06:00Z">
+        <w:r>
+          <w:t xml:space="preserve">(range: </w:t>
+        </w:r>
+      </w:ins>
+      <w:ins w:id="73" w:author="Kelly, Clint Dale" w:date="2026-02-13T14:52:00Z" w16du:dateUtc="2026-02-13T19:52:00Z">
+        <w:r>
+          <w:t>xx - xx</w:t>
+        </w:r>
+      </w:ins>
+      <w:ins w:id="74" w:author="Kelly, Clint Dale" w:date="2026-02-13T08:29:00Z" w16du:dateUtc="2026-02-13T13:29:00Z">
+        <w:r>
+          <w:t xml:space="preserve"> eggs</w:t>
+        </w:r>
+      </w:ins>
+      <w:ins w:id="75" w:author="Kelly, Clint Dale" w:date="2026-02-10T14:06:00Z" w16du:dateUtc="2026-02-10T19:06:00Z">
+        <w:r>
+          <w:t>)</w:t>
+        </w:r>
+      </w:ins>
+      <w:ins w:id="76" w:author="Kelly, Clint Dale" w:date="2026-02-13T08:29:00Z" w16du:dateUtc="2026-02-13T13:29:00Z">
+        <w:r>
+          <w:t xml:space="preserve"> </w:t>
         </w:r>
       </w:ins>
       <w:r>
@@ -533,9 +910,13 @@
         <w:t>within</w:t>
       </w:r>
       <w:r>
-        <w:t xml:space="preserve">) females by constructing a univariate hierarchical linear mixed-effects model with scaled mean egg perimeter as the response variable, clutch (first or second) as a </w:t>
-      </w:r>
-      <w:ins w:id="16" w:author="Kelly, Clint Dale" w:date="2026-02-10T14:04:00Z" w16du:dateUtc="2026-02-10T19:04:00Z">
+        <w:t xml:space="preserve">) females by constructing </w:t>
+      </w:r>
+      <w:r>
+        <w:lastRenderedPageBreak/>
+        <w:t xml:space="preserve">a univariate hierarchical linear mixed-effects model with scaled mean egg perimeter as the response variable, clutch (first or second) as a </w:t>
+      </w:r>
+      <w:ins w:id="77" w:author="Kelly, Clint Dale" w:date="2026-02-10T14:04:00Z" w16du:dateUtc="2026-02-10T19:04:00Z">
         <w:r>
           <w:t xml:space="preserve">categorical </w:t>
         </w:r>
@@ -543,17 +924,17 @@
       <w:r>
         <w:t xml:space="preserve">fixed effect, and female </w:t>
       </w:r>
-      <w:ins w:id="17" w:author="Kelly, Clint Dale" w:date="2026-02-10T09:18:00Z" w16du:dateUtc="2026-02-10T14:18:00Z">
+      <w:ins w:id="78" w:author="Kelly, Clint Dale" w:date="2026-02-10T09:18:00Z" w16du:dateUtc="2026-02-10T14:18:00Z">
         <w:r>
           <w:t>pronotum length</w:t>
         </w:r>
       </w:ins>
-      <w:del w:id="18" w:author="Kelly, Clint Dale" w:date="2026-02-10T09:18:00Z" w16du:dateUtc="2026-02-10T14:18:00Z">
+      <w:del w:id="79" w:author="Kelly, Clint Dale" w:date="2026-02-10T09:18:00Z" w16du:dateUtc="2026-02-10T14:18:00Z">
         <w:r>
           <w:delText xml:space="preserve">body mass </w:delText>
         </w:r>
       </w:del>
-      <w:ins w:id="19" w:author="Kelly, Clint Dale" w:date="2026-02-10T09:18:00Z" w16du:dateUtc="2026-02-10T14:18:00Z">
+      <w:ins w:id="80" w:author="Kelly, Clint Dale" w:date="2026-02-10T09:18:00Z" w16du:dateUtc="2026-02-10T14:18:00Z">
         <w:r>
           <w:t xml:space="preserve"> </w:t>
         </w:r>
@@ -561,7 +942,7 @@
       <w:r>
         <w:t>as a continuous covariate. I also included, as random effects, a</w:t>
       </w:r>
-      <w:ins w:id="20" w:author="Kelly, Clint Dale" w:date="2026-02-10T14:21:00Z" w16du:dateUtc="2026-02-10T19:21:00Z">
+      <w:ins w:id="81" w:author="Kelly, Clint Dale" w:date="2026-02-10T14:21:00Z" w16du:dateUtc="2026-02-10T19:21:00Z">
         <w:r>
           <w:t>n uncorrelated</w:t>
         </w:r>
@@ -569,52 +950,48 @@
       <w:r>
         <w:t xml:space="preserve"> random </w:t>
       </w:r>
-      <w:del w:id="21" w:author="Kelly, Clint Dale" w:date="2026-02-10T13:51:00Z" w16du:dateUtc="2026-02-10T18:51:00Z">
+      <w:del w:id="82" w:author="Kelly, Clint Dale" w:date="2026-02-10T13:51:00Z" w16du:dateUtc="2026-02-10T18:51:00Z">
         <w:r>
           <w:delText xml:space="preserve">slope </w:delText>
         </w:r>
       </w:del>
-      <w:ins w:id="22" w:author="Kelly, Clint Dale" w:date="2026-02-10T13:51:00Z" w16du:dateUtc="2026-02-10T18:51:00Z">
-        <w:r>
-          <w:t>intercept</w:t>
-        </w:r>
+      <w:ins w:id="83" w:author="Kelly, Clint Dale" w:date="2026-02-10T13:51:00Z" w16du:dateUtc="2026-02-10T18:51:00Z">
+        <w:r>
+          <w:t xml:space="preserve">intercept </w:t>
+        </w:r>
+      </w:ins>
+      <w:r>
+        <w:t xml:space="preserve">for each clutch </w:t>
+      </w:r>
+      <w:del w:id="84" w:author="Kelly, Clint Dale" w:date="2026-02-10T14:05:00Z" w16du:dateUtc="2026-02-10T19:05:00Z">
+        <w:r>
+          <w:delText>f</w:delText>
+        </w:r>
+      </w:del>
+      <w:del w:id="85" w:author="Kelly, Clint Dale" w:date="2026-02-10T14:04:00Z" w16du:dateUtc="2026-02-10T19:04:00Z">
+        <w:r>
+          <w:delText>or each</w:delText>
+        </w:r>
+      </w:del>
+      <w:ins w:id="86" w:author="Kelly, Clint Dale" w:date="2026-02-10T14:02:00Z" w16du:dateUtc="2026-02-10T19:02:00Z">
+        <w:r>
+          <w:t>per</w:t>
+        </w:r>
+      </w:ins>
+      <w:r>
+        <w:t xml:space="preserve"> female. In the dispersion part of the model, I included clutch as a fixed effect to estimate the within-individual (i.e. residual) variance in egg size for each clutch. I then tested whether the first and second clutch differed in egg size at the among- and within-female levels.</w:t>
+      </w:r>
+      <w:ins w:id="87" w:author="Kelly, Clint Dale" w:date="2026-02-10T12:18:00Z" w16du:dateUtc="2026-02-10T17:18:00Z">
         <w:r>
           <w:t xml:space="preserve"> </w:t>
         </w:r>
       </w:ins>
-      <w:r>
-        <w:t xml:space="preserve">for each clutch </w:t>
-      </w:r>
-      <w:del w:id="23" w:author="Kelly, Clint Dale" w:date="2026-02-10T14:05:00Z" w16du:dateUtc="2026-02-10T19:05:00Z">
-        <w:r>
-          <w:delText>f</w:delText>
-        </w:r>
-      </w:del>
-      <w:del w:id="24" w:author="Kelly, Clint Dale" w:date="2026-02-10T14:04:00Z" w16du:dateUtc="2026-02-10T19:04:00Z">
-        <w:r>
-          <w:delText>or each</w:delText>
-        </w:r>
-      </w:del>
-      <w:ins w:id="25" w:author="Kelly, Clint Dale" w:date="2026-02-10T14:02:00Z" w16du:dateUtc="2026-02-10T19:02:00Z">
-        <w:r>
-          <w:t>per</w:t>
-        </w:r>
-      </w:ins>
-      <w:r>
-        <w:t xml:space="preserve"> female. In the dispersion part of the model, I included clutch as a fixed effect to estimate the within-individual (i.e. residual) variance in egg size for each clutch. I then tested whether the first and second clutch differed in egg size at the among- and within-female levels.</w:t>
-      </w:r>
-      <w:ins w:id="26" w:author="Kelly, Clint Dale" w:date="2026-02-10T12:18:00Z" w16du:dateUtc="2026-02-10T17:18:00Z">
-        <w:r>
-          <w:t xml:space="preserve"> </w:t>
-        </w:r>
-      </w:ins>
     </w:p>
     <w:p>
       <w:pPr>
         <w:pStyle w:val="BodyText"/>
       </w:pPr>
       <w:r>
-        <w:lastRenderedPageBreak/>
         <w:t>Bayesian mixed models were run for 10000 iterations (3000 warm-up iterations) across 6 chains, with a thinning interval of 2 (total post-warm-up samples = 21,000). I used weakly informative normal priors (N (0,10)) for fixed effects and positively bound exponential (1) priors for random effects in multivariate models. The univariate hierarchical mixed models were run using default priors. I performed posterior predictive checks to ensure adequate model fits, while trace plots confirmed that models converged with low among-chain variability (Rhat = 1.00). I report posterior means with 95% credible intervals (CrIs) for all parameter estimates, where inference was based on CrIs that did not include zero.</w:t>
       </w:r>
     </w:p>
@@ -622,9 +999,9 @@
       <w:pPr>
         <w:pStyle w:val="Heading1"/>
       </w:pPr>
-      <w:bookmarkStart w:id="27" w:name="results"/>
-      <w:bookmarkEnd w:id="2"/>
-      <w:bookmarkEnd w:id="3"/>
+      <w:bookmarkStart w:id="88" w:name="results"/>
+      <w:bookmarkEnd w:id="10"/>
+      <w:bookmarkEnd w:id="11"/>
       <w:r>
         <w:t>Results</w:t>
       </w:r>
@@ -700,7 +1077,7 @@
       <w:pPr>
         <w:pStyle w:val="BodyText"/>
         <w:rPr>
-          <w:ins w:id="28" w:author="Kelly, Clint Dale" w:date="2026-02-10T10:03:00Z" w16du:dateUtc="2026-02-10T15:03:00Z"/>
+          <w:ins w:id="89" w:author="Kelly, Clint Dale" w:date="2026-02-10T10:03:00Z" w16du:dateUtc="2026-02-10T15:03:00Z"/>
         </w:rPr>
       </w:pPr>
       <w:r>
@@ -773,7 +1150,11 @@
         </m:acc>
       </m:oMath>
       <w:r>
-        <w:t xml:space="preserve"> = 3.41 ± 0.20 mm, range: 3.11 - 4.11 mm) versus first clutches (</w:t>
+        <w:t xml:space="preserve"> = 3.41 ± 0.20 mm, range: 3.11 - 4.11 </w:t>
+      </w:r>
+      <w:r>
+        <w:lastRenderedPageBreak/>
+        <w:t>mm) versus first clutches (</w:t>
       </w:r>
       <m:oMath>
         <m:acc>
@@ -796,24 +1177,19 @@
         </m:acc>
       </m:oMath>
       <w:r>
-        <w:t xml:space="preserve"> = 3.54 ± 0.21 mm, range: 3.10 - 3.93 mm; Estimate [95% CrI] = -0.92 [-0.96, -0.88]). These findings suggest that larger clutches had, on average, larger eggs, which supports the aforementioned positive within-female correlation. Female pronotum length (body size) was not correlated with either clutch (Estimate [95% CrI] = 0.06 [-0.18, 0.30]) or egg (Estimate [95% CrI] = -0.03 [-0.24, 0.16]) </w:t>
-      </w:r>
-      <w:proofErr w:type="spellStart"/>
-      <w:r>
-        <w:t>size.</w:t>
-      </w:r>
-      <w:del w:id="29" w:author="Kelly, Clint Dale" w:date="2026-02-10T10:00:00Z" w16du:dateUtc="2026-02-10T15:00:00Z">
+        <w:t xml:space="preserve"> = 3.54 ± 0.21 mm, range: 3.10 - 3.93 mm; Estimate [95% CrI] = -0.92 [-0.96, -0.88]). These findings suggest that larger clutches had, on average, larger eggs, which supports the aforementioned positive within-female correlation. Female pronotum length (body size) was not correlated with either clutch (Estimate [95% CrI] = 0.06 [-0.18, 0.30]) or egg (Estimate [95% CrI] = -0.03 [-0.24, 0.16]) size.</w:t>
+      </w:r>
+      <w:del w:id="90" w:author="Kelly, Clint Dale" w:date="2026-02-10T10:00:00Z" w16du:dateUtc="2026-02-10T15:00:00Z">
         <w:r>
           <w:delText xml:space="preserve"> ###</w:delText>
         </w:r>
       </w:del>
-      <w:proofErr w:type="spellEnd"/>
     </w:p>
     <w:p>
       <w:pPr>
         <w:pStyle w:val="BodyText"/>
         <w:rPr>
-          <w:ins w:id="30" w:author="Kelly, Clint Dale" w:date="2026-02-10T10:03:00Z" w16du:dateUtc="2026-02-10T15:03:00Z"/>
+          <w:ins w:id="91" w:author="Kelly, Clint Dale" w:date="2026-02-10T10:03:00Z" w16du:dateUtc="2026-02-10T15:03:00Z"/>
         </w:rPr>
       </w:pPr>
     </w:p>
@@ -821,27 +1197,174 @@
       <w:pPr>
         <w:pStyle w:val="BodyText"/>
       </w:pPr>
-      <w:ins w:id="31" w:author="Kelly, Clint Dale" w:date="2026-02-10T10:03:00Z" w16du:dateUtc="2026-02-10T15:03:00Z">
-        <w:r>
-          <w:lastRenderedPageBreak/>
-          <w:t xml:space="preserve">Among-individual variation for egg size was () and for egg number was (). Therefore, </w:t>
+      <w:ins w:id="92" w:author="Kelly, Clint Dale" w:date="2026-02-12T17:07:00Z" w16du:dateUtc="2026-02-12T22:07:00Z">
+        <w:r>
+          <w:t>I found high a</w:t>
+        </w:r>
+      </w:ins>
+      <w:ins w:id="93" w:author="Kelly, Clint Dale" w:date="2026-02-10T10:03:00Z" w16du:dateUtc="2026-02-10T15:03:00Z">
+        <w:r>
+          <w:t>mong-</w:t>
+        </w:r>
+      </w:ins>
+      <w:ins w:id="94" w:author="Kelly, Clint Dale" w:date="2026-02-12T17:13:00Z" w16du:dateUtc="2026-02-12T22:13:00Z">
+        <w:r>
+          <w:t xml:space="preserve"> and within-</w:t>
+        </w:r>
+      </w:ins>
+      <w:ins w:id="95" w:author="Kelly, Clint Dale" w:date="2026-02-10T10:03:00Z" w16du:dateUtc="2026-02-10T15:03:00Z">
+        <w:r>
+          <w:t xml:space="preserve">individual variation for egg size </w:t>
+        </w:r>
+      </w:ins>
+      <w:ins w:id="96" w:author="Kelly, Clint Dale" w:date="2026-02-12T17:08:00Z" w16du:dateUtc="2026-02-12T22:08:00Z">
+        <w:r>
+          <w:t>(</w:t>
+        </w:r>
+      </w:ins>
+      <w:ins w:id="97" w:author="Kelly, Clint Dale" w:date="2026-02-12T17:14:00Z" w16du:dateUtc="2026-02-12T22:14:00Z">
+        <w:r>
+          <w:t>among</w:t>
+        </w:r>
+        <w:proofErr w:type="gramStart"/>
+        <w:r>
+          <w:t xml:space="preserve">: </w:t>
+        </w:r>
+        <w:r>
+          <w:t>;</w:t>
+        </w:r>
+        <w:proofErr w:type="gramEnd"/>
+        <w:r>
+          <w:t xml:space="preserve"> within</w:t>
+        </w:r>
+        <w:proofErr w:type="gramStart"/>
+        <w:r>
+          <w:t xml:space="preserve">: </w:t>
+        </w:r>
+      </w:ins>
+      <w:ins w:id="98" w:author="Kelly, Clint Dale" w:date="2026-02-12T17:08:00Z" w16du:dateUtc="2026-02-12T22:08:00Z">
+        <w:r>
+          <w:t>)</w:t>
+        </w:r>
+        <w:proofErr w:type="gramEnd"/>
+        <w:r>
+          <w:t xml:space="preserve"> and</w:t>
+        </w:r>
+      </w:ins>
+      <w:ins w:id="99" w:author="Kelly, Clint Dale" w:date="2026-02-10T10:03:00Z" w16du:dateUtc="2026-02-10T15:03:00Z">
+        <w:r>
+          <w:t xml:space="preserve"> egg number (</w:t>
+        </w:r>
+      </w:ins>
+      <w:ins w:id="100" w:author="Kelly, Clint Dale" w:date="2026-02-12T17:14:00Z" w16du:dateUtc="2026-02-12T22:14:00Z">
+        <w:r>
+          <w:t>among:</w:t>
+        </w:r>
+        <w:proofErr w:type="gramStart"/>
+        <w:r>
+          <w:t xml:space="preserve">  ;</w:t>
+        </w:r>
+        <w:proofErr w:type="gramEnd"/>
+        <w:r>
+          <w:t xml:space="preserve"> within</w:t>
+        </w:r>
+        <w:proofErr w:type="gramStart"/>
+        <w:r>
+          <w:t xml:space="preserve">: </w:t>
+        </w:r>
+      </w:ins>
+      <w:ins w:id="101" w:author="Kelly, Clint Dale" w:date="2026-02-10T10:03:00Z" w16du:dateUtc="2026-02-10T15:03:00Z">
+        <w:r>
+          <w:t>)</w:t>
+        </w:r>
+        <w:proofErr w:type="gramEnd"/>
+        <w:r>
+          <w:t>.</w:t>
+        </w:r>
+      </w:ins>
+      <w:ins w:id="102" w:author="Kelly, Clint Dale" w:date="2026-02-12T17:10:00Z" w16du:dateUtc="2026-02-12T22:10:00Z">
+        <w:r>
+          <w:t xml:space="preserve"> </w:t>
+        </w:r>
+      </w:ins>
+      <w:r>
+        <w:t xml:space="preserve">Egg size </w:t>
+      </w:r>
+      <w:del w:id="103" w:author="Kelly, Clint Dale" w:date="2026-02-12T17:09:00Z" w16du:dateUtc="2026-02-12T22:09:00Z">
+        <w:r>
+          <w:delText xml:space="preserve">exhibited significant repeatability across female broods </w:delText>
+        </w:r>
+      </w:del>
+      <w:r>
+        <w:t>(</w:t>
+      </w:r>
+      <w:r>
+        <w:rPr>
+          <w:i/>
+          <w:iCs/>
+        </w:rPr>
+        <w:t>R</w:t>
+      </w:r>
+      <w:r>
+        <w:t xml:space="preserve"> [95% CI] = 0.40 [0.21, 0.57]) </w:t>
+      </w:r>
+      <w:del w:id="104" w:author="Kelly, Clint Dale" w:date="2026-02-12T17:09:00Z" w16du:dateUtc="2026-02-12T22:09:00Z">
+        <w:r>
+          <w:delText xml:space="preserve">while </w:delText>
+        </w:r>
+      </w:del>
+      <w:ins w:id="105" w:author="Kelly, Clint Dale" w:date="2026-02-12T17:09:00Z" w16du:dateUtc="2026-02-12T22:09:00Z">
+        <w:r>
+          <w:rPr>
+            <w:highlight w:val="yellow"/>
+          </w:rPr>
+          <w:t>and</w:t>
+        </w:r>
+        <w:r>
+          <w:rPr>
+            <w:highlight w:val="yellow"/>
+            <w:rPrChange w:id="106" w:author="Kelly, Clint Dale" w:date="2026-02-10T09:50:00Z" w16du:dateUtc="2026-02-10T14:50:00Z">
+              <w:rPr/>
+            </w:rPrChange>
+          </w:rPr>
+          <w:t xml:space="preserve"> </w:t>
         </w:r>
       </w:ins>
       <w:r>
         <w:rPr>
           <w:highlight w:val="yellow"/>
-          <w:rPrChange w:id="32" w:author="Kelly, Clint Dale" w:date="2026-02-10T09:50:00Z" w16du:dateUtc="2026-02-10T14:50:00Z">
+          <w:rPrChange w:id="107" w:author="Kelly, Clint Dale" w:date="2026-02-10T09:50:00Z" w16du:dateUtc="2026-02-10T14:50:00Z">
             <w:rPr/>
           </w:rPrChange>
         </w:rPr>
-        <w:t>Egg size exhibited significant repeatability across female broods (</w:t>
+        <w:t xml:space="preserve">clutch size </w:t>
+      </w:r>
+      <w:del w:id="108" w:author="Kelly, Clint Dale" w:date="2026-02-12T17:09:00Z" w16du:dateUtc="2026-02-12T22:09:00Z">
+        <w:r>
+          <w:rPr>
+            <w:highlight w:val="yellow"/>
+            <w:rPrChange w:id="109" w:author="Kelly, Clint Dale" w:date="2026-02-10T09:50:00Z" w16du:dateUtc="2026-02-10T14:50:00Z">
+              <w:rPr/>
+            </w:rPrChange>
+          </w:rPr>
+          <w:delText xml:space="preserve">did not </w:delText>
+        </w:r>
+      </w:del>
+      <w:r>
+        <w:rPr>
+          <w:highlight w:val="yellow"/>
+          <w:rPrChange w:id="110" w:author="Kelly, Clint Dale" w:date="2026-02-10T09:50:00Z" w16du:dateUtc="2026-02-10T14:50:00Z">
+            <w:rPr/>
+          </w:rPrChange>
+        </w:rPr>
+        <w:t>(</w:t>
       </w:r>
       <w:r>
         <w:rPr>
           <w:i/>
           <w:iCs/>
           <w:highlight w:val="yellow"/>
-          <w:rPrChange w:id="33" w:author="Kelly, Clint Dale" w:date="2026-02-10T09:50:00Z" w16du:dateUtc="2026-02-10T14:50:00Z">
+          <w:rPrChange w:id="111" w:author="Kelly, Clint Dale" w:date="2026-02-10T09:50:00Z" w16du:dateUtc="2026-02-10T14:50:00Z">
             <w:rPr>
               <w:i/>
               <w:iCs/>
@@ -853,41 +1376,57 @@
       <w:r>
         <w:rPr>
           <w:highlight w:val="yellow"/>
-          <w:rPrChange w:id="34" w:author="Kelly, Clint Dale" w:date="2026-02-10T09:50:00Z" w16du:dateUtc="2026-02-10T14:50:00Z">
+          <w:rPrChange w:id="112" w:author="Kelly, Clint Dale" w:date="2026-02-10T09:50:00Z" w16du:dateUtc="2026-02-10T14:50:00Z">
             <w:rPr/>
           </w:rPrChange>
         </w:rPr>
-        <w:t xml:space="preserve"> [95% CI] = 0.40 [0.21, 0.57]) while clutch size did not (</w:t>
-      </w:r>
-      <w:r>
-        <w:rPr>
-          <w:i/>
-          <w:iCs/>
-          <w:highlight w:val="yellow"/>
-          <w:rPrChange w:id="35" w:author="Kelly, Clint Dale" w:date="2026-02-10T09:50:00Z" w16du:dateUtc="2026-02-10T14:50:00Z">
-            <w:rPr>
-              <w:i/>
-              <w:iCs/>
-            </w:rPr>
-          </w:rPrChange>
-        </w:rPr>
-        <w:t>R</w:t>
-      </w:r>
-      <w:r>
-        <w:rPr>
-          <w:highlight w:val="yellow"/>
-          <w:rPrChange w:id="36" w:author="Kelly, Clint Dale" w:date="2026-02-10T09:50:00Z" w16du:dateUtc="2026-02-10T14:50:00Z">
-            <w:rPr/>
-          </w:rPrChange>
-        </w:rPr>
         <w:t xml:space="preserve"> = 0.03 [0.0, 0.32])</w:t>
       </w:r>
-      <w:ins w:id="37" w:author="Kelly, Clint Dale" w:date="2026-02-10T10:00:00Z" w16du:dateUtc="2026-02-10T15:00:00Z">
+      <w:ins w:id="113" w:author="Kelly, Clint Dale" w:date="2026-02-12T17:09:00Z" w16du:dateUtc="2026-02-12T22:09:00Z">
+        <w:r>
+          <w:t xml:space="preserve"> </w:t>
+        </w:r>
+      </w:ins>
+      <w:ins w:id="114" w:author="Kelly, Clint Dale" w:date="2026-02-12T17:10:00Z" w16du:dateUtc="2026-02-12T22:10:00Z">
+        <w:r>
+          <w:t xml:space="preserve">are </w:t>
+        </w:r>
+      </w:ins>
+      <w:ins w:id="115" w:author="Kelly, Clint Dale" w:date="2026-02-12T17:09:00Z" w16du:dateUtc="2026-02-12T22:09:00Z">
+        <w:r>
+          <w:rPr>
+            <w:highlight w:val="yellow"/>
+          </w:rPr>
+          <w:t>significant</w:t>
+        </w:r>
+      </w:ins>
+      <w:ins w:id="116" w:author="Kelly, Clint Dale" w:date="2026-02-12T17:10:00Z" w16du:dateUtc="2026-02-12T22:10:00Z">
+        <w:r>
+          <w:rPr>
+            <w:highlight w:val="yellow"/>
+          </w:rPr>
+          <w:t>ly</w:t>
+        </w:r>
+      </w:ins>
+      <w:ins w:id="117" w:author="Kelly, Clint Dale" w:date="2026-02-12T17:09:00Z" w16du:dateUtc="2026-02-12T22:09:00Z">
+        <w:r>
+          <w:rPr>
+            <w:highlight w:val="yellow"/>
+          </w:rPr>
+          <w:t xml:space="preserve"> repeatab</w:t>
+        </w:r>
+      </w:ins>
+      <w:ins w:id="118" w:author="Kelly, Clint Dale" w:date="2026-02-12T17:10:00Z" w16du:dateUtc="2026-02-12T22:10:00Z">
+        <w:r>
+          <w:t>le</w:t>
+        </w:r>
+      </w:ins>
+      <w:ins w:id="119" w:author="Kelly, Clint Dale" w:date="2026-02-10T10:00:00Z" w16du:dateUtc="2026-02-10T15:00:00Z">
         <w:r>
           <w:t>.</w:t>
         </w:r>
       </w:ins>
-      <w:del w:id="38" w:author="Kelly, Clint Dale" w:date="2026-02-10T10:00:00Z" w16du:dateUtc="2026-02-10T15:00:00Z">
+      <w:del w:id="120" w:author="Kelly, Clint Dale" w:date="2026-02-10T10:00:00Z" w16du:dateUtc="2026-02-10T15:00:00Z">
         <w:r>
           <w:delText>.###</w:delText>
         </w:r>
@@ -933,7 +1472,15 @@
         </w:r>
       </w:hyperlink>
       <w:r>
-        <w:t>) but within-clutch egg size variation was smaller in first than in second clutches (</w:t>
+        <w:t>)</w:t>
+      </w:r>
+      <w:ins w:id="121" w:author="Kelly, Clint Dale" w:date="2026-02-12T14:28:00Z" w16du:dateUtc="2026-02-12T19:28:00Z">
+        <w:r>
+          <w:t>,</w:t>
+        </w:r>
+      </w:ins>
+      <w:r>
+        <w:t xml:space="preserve"> but within-clutch egg size variation was smaller in first than in second clutches (</w:t>
       </w:r>
       <m:oMath>
         <m:r>
@@ -970,6 +1517,11 @@
       <w:r>
         <w:t>). Within-clutch egg size variation (i.e. standard deviation of egg size per clutch) was related to clutch size in first (</w:t>
       </w:r>
+      <w:ins w:id="122" w:author="Kelly, Clint Dale" w:date="2026-02-12T17:12:00Z" w16du:dateUtc="2026-02-12T22:12:00Z">
+        <w:r>
+          <w:t xml:space="preserve">Spearman’s correlation: </w:t>
+        </w:r>
+      </w:ins>
       <m:oMath>
         <m:r>
           <w:rPr>
@@ -997,8 +1549,8 @@
       <w:pPr>
         <w:pStyle w:val="Heading1"/>
       </w:pPr>
-      <w:bookmarkStart w:id="39" w:name="discussion"/>
-      <w:bookmarkEnd w:id="27"/>
+      <w:bookmarkStart w:id="123" w:name="discussion"/>
+      <w:bookmarkEnd w:id="88"/>
       <w:r>
         <w:t>Discussion</w:t>
       </w:r>
@@ -1006,9 +1558,16 @@
     <w:p>
       <w:pPr>
         <w:pStyle w:val="FirstParagraph"/>
-      </w:pPr>
-      <w:r>
-        <w:t xml:space="preserve">My multivariate repeated-measures analysis of clutch and egg size found no evidence that female European earwigs trade off egg number and egg size. Despite failing to support general life history theory (Roff 1992; Stearns 1992) and contradicting the results of a previous study in this species (Koch and Meunier 2014), it is the first, to my knowledge, to partition the phenotypic correlation between egg number and size into its among- and within-individual components. Although many studies have supported the prediction that egg number and size trade off, some have not (Roff 1992; Fox and Czesak 2000). Because these previous studies relied on phenotypic correlations to examine the relationship between egg number and size, it is not possible to assess the extent to which this prediction is empirically supported across taxa, given the propensity for phenotypic correlations to generate spurious and misleading associations. For example, Koch and Meunier (2014) showed that, in an Italian population of </w:t>
+        <w:rPr>
+          <w:ins w:id="124" w:author="Kelly, Clint Dale" w:date="2026-02-12T16:53:00Z" w16du:dateUtc="2026-02-12T21:53:00Z"/>
+        </w:rPr>
+      </w:pPr>
+      <w:r>
+        <w:t xml:space="preserve">My multivariate repeated-measures analysis of clutch and egg size found no evidence that female European earwigs trade off egg number and egg size. Despite failing to support general life history theory (Roff 1992; Stearns 1992) and contradicting the results of a previous study in this species (Koch and Meunier 2014), it is the first, to my knowledge, to partition the phenotypic correlation between egg number and size into its among- and within-individual components. Although many studies have supported the prediction that egg number </w:t>
+      </w:r>
+      <w:r>
+        <w:lastRenderedPageBreak/>
+        <w:t xml:space="preserve">and size trade off, some have not (Roff 1992; Fox and Czesak 2000). Because these previous studies relied on phenotypic correlations to examine the relationship between egg number and size, it is not possible to assess the extent to which this prediction is empirically supported across taxa, given the propensity for phenotypic correlations to generate spurious and misleading associations. For example, Koch and Meunier (2014) showed that, in an Italian population of </w:t>
       </w:r>
       <w:r>
         <w:rPr>
@@ -1018,45 +1577,107 @@
         <w:t>F. auricularia</w:t>
       </w:r>
       <w:r>
-        <w:t xml:space="preserve">, residual egg number and residual egg size (adjusted for female body mass) are negatively correlated at the phenotypic level. However, these findings must be treated with caution; they are based on pseudo-replicated data (both clutches for each female </w:t>
-      </w:r>
-      <w:r>
-        <w:lastRenderedPageBreak/>
-        <w:t>were pooled and treated as independent), a situation that can lead to Simpson’s Paradox (Simpson 1951) and spurious correlations because within-individual relationships are masked by among-individual variation. Indeed, I also observed a negative, albeit weaker, correlation at the phenotypic level. However, by partitioning the variance into its among- and within-individual components, I found that females do not make the predicted trade-off. Rather, I found evidence that egg number and size are positively correlated within females.</w:t>
-      </w:r>
+        <w:t xml:space="preserve">, residual egg number and residual egg size (adjusted for female body mass) are negatively correlated at the phenotypic level. However, these findings must be treated with caution; they are based on pseudo-replicated data (both clutches for each female were pooled and treated as independent), a situation that can lead to Simpson’s Paradox (Simpson 1951) and spurious correlations because within-individual relationships are masked by among-individual variation. Indeed, I also observed </w:t>
+      </w:r>
+      <w:ins w:id="125" w:author="Kelly, Clint Dale" w:date="2026-02-12T15:40:00Z" w16du:dateUtc="2026-02-12T20:40:00Z">
+        <w:r>
+          <w:t xml:space="preserve">no correlation </w:t>
+        </w:r>
+      </w:ins>
+      <w:del w:id="126" w:author="Kelly, Clint Dale" w:date="2026-02-12T15:40:00Z" w16du:dateUtc="2026-02-12T20:40:00Z">
+        <w:r>
+          <w:delText>a ne</w:delText>
+        </w:r>
+      </w:del>
+      <w:del w:id="127" w:author="Kelly, Clint Dale" w:date="2026-02-12T15:41:00Z" w16du:dateUtc="2026-02-12T20:41:00Z">
+        <w:r>
+          <w:delText>gative, albeit weaker, correlation</w:delText>
+        </w:r>
+      </w:del>
+      <w:r>
+        <w:t xml:space="preserve"> at the phenotypic level. However, by partitioning the variance into its among- and within-individual components, I found that females do not make the predicted trade-off. Rather, I found evidence that egg number and size are positively correlated within females.</w:t>
+      </w:r>
+      <w:ins w:id="128" w:author="Kelly, Clint Dale" w:date="2026-02-12T15:41:00Z" w16du:dateUtc="2026-02-12T20:41:00Z">
+        <w:r>
+          <w:t xml:space="preserve"> </w:t>
+        </w:r>
+      </w:ins>
     </w:p>
     <w:p>
       <w:pPr>
         <w:pStyle w:val="BodyText"/>
-      </w:pPr>
-      <w:r>
-        <w:t xml:space="preserve">My study revealed that second clutches comprised, on average, fewer and smaller eggs than first clutches, which can be explained at both the proximate and ultimate levels of causation. My findings are consistent with those of another study </w:t>
-      </w:r>
-      <w:del w:id="40" w:author="Kelly, Clint Dale" w:date="2026-02-10T12:37:00Z" w16du:dateUtc="2026-02-10T17:37:00Z">
+        <w:rPr>
+          <w:del w:id="129" w:author="Kelly, Clint Dale" w:date="2026-02-12T17:04:00Z" w16du:dateUtc="2026-02-12T22:04:00Z"/>
+        </w:rPr>
+        <w:pPrChange w:id="130" w:author="Kelly, Clint Dale" w:date="2026-02-12T16:40:00Z" w16du:dateUtc="2026-02-12T21:40:00Z">
+          <w:pPr>
+            <w:pStyle w:val="FirstParagraph"/>
+          </w:pPr>
+        </w:pPrChange>
+      </w:pPr>
+    </w:p>
+    <w:p>
+      <w:pPr>
+        <w:pStyle w:val="BodyText"/>
+      </w:pPr>
+      <w:r>
+        <w:t>My study revealed that second clutches comprised, on average, fewer and smaller eggs than first clutches</w:t>
+      </w:r>
+      <w:ins w:id="131" w:author="Kelly, Clint Dale" w:date="2026-02-12T16:37:00Z" w16du:dateUtc="2026-02-12T21:37:00Z">
+        <w:r>
+          <w:t xml:space="preserve">. </w:t>
+        </w:r>
+        <w:r>
+          <w:t>This finding refutes the terminal investment hypothesis, as female second clutches were neither, on average, larger nor comprised larger eggs.</w:t>
+        </w:r>
+        <w:r>
+          <w:t xml:space="preserve"> </w:t>
+        </w:r>
+      </w:ins>
+      <w:del w:id="132" w:author="Kelly, Clint Dale" w:date="2026-02-12T17:05:00Z" w16du:dateUtc="2026-02-12T22:05:00Z">
+        <w:r>
+          <w:rPr>
+            <w:highlight w:val="yellow"/>
+            <w:rPrChange w:id="133" w:author="Kelly, Clint Dale" w:date="2026-02-12T16:38:00Z" w16du:dateUtc="2026-02-12T21:38:00Z">
+              <w:rPr/>
+            </w:rPrChange>
+          </w:rPr>
+          <w:delText>, which can be explained at both the proximate and ultimate levels of causation.</w:delText>
+        </w:r>
+        <w:r>
+          <w:delText xml:space="preserve"> </w:delText>
+        </w:r>
+      </w:del>
+      <w:r>
+        <w:t>My findings</w:t>
+      </w:r>
+      <w:ins w:id="134" w:author="Kelly, Clint Dale" w:date="2026-02-12T17:05:00Z" w16du:dateUtc="2026-02-12T22:05:00Z">
+        <w:r>
+          <w:t>, however,</w:t>
+        </w:r>
+      </w:ins>
+      <w:r>
+        <w:t xml:space="preserve"> are consistent with those of another study </w:t>
+      </w:r>
+      <w:del w:id="135" w:author="Kelly, Clint Dale" w:date="2026-02-10T12:37:00Z" w16du:dateUtc="2026-02-10T17:37:00Z">
         <w:r>
           <w:delText xml:space="preserve">on </w:delText>
         </w:r>
       </w:del>
-      <w:ins w:id="41" w:author="Kelly, Clint Dale" w:date="2026-02-10T12:37:00Z" w16du:dateUtc="2026-02-10T17:37:00Z">
-        <w:r>
-          <w:t>o</w:t>
-        </w:r>
-        <w:r>
-          <w:t>f</w:t>
-        </w:r>
-        <w:r>
-          <w:t xml:space="preserve"> </w:t>
+      <w:ins w:id="136" w:author="Kelly, Clint Dale" w:date="2026-02-10T12:37:00Z" w16du:dateUtc="2026-02-10T17:37:00Z">
+        <w:r>
+          <w:t xml:space="preserve">of </w:t>
         </w:r>
       </w:ins>
       <w:r>
         <w:t xml:space="preserve">a Montreal population (Tourneur and Gingras 1992) and with </w:t>
       </w:r>
-      <w:del w:id="42" w:author="Kelly, Clint Dale" w:date="2026-02-10T12:37:00Z" w16du:dateUtc="2026-02-10T17:37:00Z">
+      <w:del w:id="137" w:author="Kelly, Clint Dale" w:date="2026-02-10T12:37:00Z" w16du:dateUtc="2026-02-10T17:37:00Z">
         <w:r>
           <w:delText>one</w:delText>
         </w:r>
       </w:del>
-      <w:ins w:id="43" w:author="Kelly, Clint Dale" w:date="2026-02-10T12:37:00Z" w16du:dateUtc="2026-02-10T17:37:00Z">
+      <w:ins w:id="138" w:author="Kelly, Clint Dale" w:date="2026-02-10T12:37:00Z" w16du:dateUtc="2026-02-10T17:37:00Z">
         <w:r>
           <w:t>those of another study</w:t>
         </w:r>
@@ -1072,27 +1693,52 @@
         <w:t>F. auricularia</w:t>
       </w:r>
       <w:r>
-        <w:t xml:space="preserve">. Specifically, they suggested that second clutches are smaller than first ones because some (or all) oviarioles become non-functional and thus produce no eggs after the first clutch. This reduction in ovariole number might explain the smaller second clutches that I observed here, but why did females not produce larger eggs and thus exhibit the expected number-size trade-off? One possibility is that females had a </w:t>
-      </w:r>
-      <w:ins w:id="44" w:author="Kelly, Clint Dale" w:date="2026-02-10T12:43:00Z" w16du:dateUtc="2026-02-10T17:43:00Z">
+        <w:t xml:space="preserve">. Specifically, they suggested that second clutches are smaller than first ones because some (or all) oviarioles become non-functional </w:t>
+      </w:r>
+      <w:r>
+        <w:lastRenderedPageBreak/>
+        <w:t xml:space="preserve">and thus produce no eggs after the first clutch. This reduction in ovariole number might explain the smaller second clutches that I observed here, but why did females not produce larger eggs and thus exhibit the expected number-size trade-off? One possibility is that </w:t>
+      </w:r>
+      <w:ins w:id="139" w:author="Kelly, Clint Dale" w:date="2026-02-12T14:20:00Z" w16du:dateUtc="2026-02-12T19:20:00Z">
+        <w:r>
+          <w:t xml:space="preserve">my </w:t>
+        </w:r>
+      </w:ins>
+      <w:r>
+        <w:t xml:space="preserve">females had a </w:t>
+      </w:r>
+      <w:ins w:id="140" w:author="Kelly, Clint Dale" w:date="2026-02-10T12:43:00Z" w16du:dateUtc="2026-02-10T17:43:00Z">
         <w:r>
           <w:t xml:space="preserve">proportionally </w:t>
         </w:r>
       </w:ins>
       <w:r>
-        <w:t xml:space="preserve">shallower resource pool from which to build eggs for the second clutch, for example, because they had less time to accumulate reproductive resources for the second clutch than for the first. Females in the wild presumably spent from mid-spring to mid-fall acquiring resources for reproduction, while they had only about a month in the laboratory to do so for the second one. Hence, by partitioning their </w:t>
-      </w:r>
-      <w:bookmarkStart w:id="45" w:name="_Hlk221619807"/>
-      <w:ins w:id="46" w:author="Kelly, Clint Dale" w:date="2026-02-10T12:43:00Z" w16du:dateUtc="2026-02-10T17:43:00Z">
+        <w:t xml:space="preserve">shallower resource pool from which to build eggs for the second clutch, for example, because they had less time to accumulate reproductive resources for </w:t>
+      </w:r>
+      <w:del w:id="141" w:author="Kelly, Clint Dale" w:date="2026-02-12T14:20:00Z" w16du:dateUtc="2026-02-12T19:20:00Z">
+        <w:r>
+          <w:delText>the second clutch</w:delText>
+        </w:r>
+      </w:del>
+      <w:ins w:id="142" w:author="Kelly, Clint Dale" w:date="2026-02-12T14:20:00Z" w16du:dateUtc="2026-02-12T19:20:00Z">
+        <w:r>
+          <w:t>it</w:t>
+        </w:r>
+      </w:ins>
+      <w:r>
+        <w:t xml:space="preserve"> than for the first. Females in the wild presumably spent from mid-spring to mid-fall acquiring resources for reproduction, while they had only about a month in the laboratory to do so for the second one. Hence, by partitioning their </w:t>
+      </w:r>
+      <w:bookmarkStart w:id="143" w:name="_Hlk221619807"/>
+      <w:ins w:id="144" w:author="Kelly, Clint Dale" w:date="2026-02-10T12:43:00Z" w16du:dateUtc="2026-02-10T17:43:00Z">
         <w:r>
           <w:t xml:space="preserve">proportionally </w:t>
         </w:r>
       </w:ins>
-      <w:bookmarkEnd w:id="45"/>
+      <w:bookmarkEnd w:id="143"/>
       <w:r>
         <w:t xml:space="preserve">fewer resources equally to each </w:t>
       </w:r>
-      <w:ins w:id="47" w:author="Kelly, Clint Dale" w:date="2026-02-10T12:38:00Z" w16du:dateUtc="2026-02-10T17:38:00Z">
+      <w:ins w:id="145" w:author="Kelly, Clint Dale" w:date="2026-02-10T12:38:00Z" w16du:dateUtc="2026-02-10T17:38:00Z">
         <w:r>
           <w:t xml:space="preserve">of the fewer </w:t>
         </w:r>
@@ -1100,69 +1746,172 @@
       <w:r>
         <w:t>functional ovariole</w:t>
       </w:r>
-      <w:ins w:id="48" w:author="Kelly, Clint Dale" w:date="2026-02-10T12:38:00Z" w16du:dateUtc="2026-02-10T17:38:00Z">
+      <w:ins w:id="146" w:author="Kelly, Clint Dale" w:date="2026-02-10T12:38:00Z" w16du:dateUtc="2026-02-10T17:38:00Z">
         <w:r>
           <w:t>s</w:t>
         </w:r>
       </w:ins>
       <w:r>
-        <w:t xml:space="preserve"> during their second bout of oogenesis, females produced fewer and smaller eggs than in their first clutches. This proximate explanation assumes that females </w:t>
-      </w:r>
-      <w:ins w:id="49" w:author="Kelly, Clint Dale" w:date="2026-02-10T12:38:00Z" w16du:dateUtc="2026-02-10T17:38:00Z">
+        <w:t xml:space="preserve"> during their second bout of oogenesis, females produced fewer and smaller eggs</w:t>
+      </w:r>
+      <w:ins w:id="147" w:author="Kelly, Clint Dale" w:date="2026-02-13T08:45:00Z" w16du:dateUtc="2026-02-13T13:45:00Z">
+        <w:r>
+          <w:t>, on average,</w:t>
+        </w:r>
+      </w:ins>
+      <w:r>
+        <w:t xml:space="preserve"> than in their first clutches. </w:t>
+      </w:r>
+      <w:ins w:id="148" w:author="Kelly, Clint Dale" w:date="2026-02-13T11:04:00Z" w16du:dateUtc="2026-02-13T16:04:00Z">
+        <w:r>
+          <w:t>Inspection of Figure 1</w:t>
+        </w:r>
+      </w:ins>
+      <w:ins w:id="149" w:author="Kelly, Clint Dale" w:date="2026-02-13T11:05:00Z" w16du:dateUtc="2026-02-13T16:05:00Z">
+        <w:r>
+          <w:t xml:space="preserve"> </w:t>
+        </w:r>
+      </w:ins>
+      <w:ins w:id="150" w:author="Kelly, Clint Dale" w:date="2026-02-13T11:04:00Z" w16du:dateUtc="2026-02-13T16:04:00Z">
+        <w:r>
+          <w:t xml:space="preserve">shows that some females exhibit the expected trade-off, suggesting that at least some were able to acquire enough resources to produce larger eggs in their smaller second clutch. </w:t>
+        </w:r>
+      </w:ins>
+      <w:r>
+        <w:t>Th</w:t>
+      </w:r>
+      <w:ins w:id="151" w:author="Kelly, Clint Dale" w:date="2026-02-13T11:05:00Z" w16du:dateUtc="2026-02-13T16:05:00Z">
+        <w:r>
+          <w:t>e</w:t>
+        </w:r>
+      </w:ins>
+      <w:del w:id="152" w:author="Kelly, Clint Dale" w:date="2026-02-13T11:05:00Z" w16du:dateUtc="2026-02-13T16:05:00Z">
+        <w:r>
+          <w:delText>is</w:delText>
+        </w:r>
+      </w:del>
+      <w:r>
+        <w:t xml:space="preserve"> </w:t>
+      </w:r>
+      <w:ins w:id="153" w:author="Kelly, Clint Dale" w:date="2026-02-13T11:05:00Z" w16du:dateUtc="2026-02-13T16:05:00Z">
+        <w:r>
+          <w:t xml:space="preserve">above </w:t>
+        </w:r>
+      </w:ins>
+      <w:r>
+        <w:t xml:space="preserve">proximate explanation assumes that females </w:t>
+      </w:r>
+      <w:ins w:id="154" w:author="Kelly, Clint Dale" w:date="2026-02-10T12:38:00Z" w16du:dateUtc="2026-02-10T17:38:00Z">
         <w:r>
           <w:t xml:space="preserve">allocate resources </w:t>
         </w:r>
       </w:ins>
-      <w:ins w:id="50" w:author="Kelly, Clint Dale" w:date="2026-02-10T12:40:00Z" w16du:dateUtc="2026-02-10T17:40:00Z">
+      <w:ins w:id="155" w:author="Kelly, Clint Dale" w:date="2026-02-10T12:40:00Z" w16du:dateUtc="2026-02-10T17:40:00Z">
         <w:r>
           <w:t xml:space="preserve">equally </w:t>
         </w:r>
       </w:ins>
-      <w:ins w:id="51" w:author="Kelly, Clint Dale" w:date="2026-02-10T12:38:00Z" w16du:dateUtc="2026-02-10T17:38:00Z">
-        <w:r>
-          <w:t xml:space="preserve">to each </w:t>
-        </w:r>
-        <w:r>
-          <w:lastRenderedPageBreak/>
-          <w:t>functional ova</w:t>
-        </w:r>
-      </w:ins>
-      <w:ins w:id="52" w:author="Kelly, Clint Dale" w:date="2026-02-10T12:39:00Z" w16du:dateUtc="2026-02-10T17:39:00Z">
-        <w:r>
-          <w:t xml:space="preserve">riole rather than </w:t>
-        </w:r>
-      </w:ins>
-      <w:ins w:id="53" w:author="Kelly, Clint Dale" w:date="2026-02-10T12:41:00Z" w16du:dateUtc="2026-02-10T17:41:00Z">
+      <w:ins w:id="156" w:author="Kelly, Clint Dale" w:date="2026-02-10T12:38:00Z" w16du:dateUtc="2026-02-10T17:38:00Z">
+        <w:r>
+          <w:t>to each functional ova</w:t>
+        </w:r>
+      </w:ins>
+      <w:ins w:id="157" w:author="Kelly, Clint Dale" w:date="2026-02-10T12:39:00Z" w16du:dateUtc="2026-02-10T17:39:00Z">
+        <w:r>
+          <w:t>riole</w:t>
+        </w:r>
+      </w:ins>
+      <w:ins w:id="158" w:author="Kelly, Clint Dale" w:date="2026-02-12T16:17:00Z" w16du:dateUtc="2026-02-12T21:17:00Z">
+        <w:r>
+          <w:t>,</w:t>
+        </w:r>
+      </w:ins>
+      <w:ins w:id="159" w:author="Kelly, Clint Dale" w:date="2026-02-10T12:39:00Z" w16du:dateUtc="2026-02-10T17:39:00Z">
+        <w:r>
+          <w:t xml:space="preserve"> rather than </w:t>
+        </w:r>
+      </w:ins>
+      <w:ins w:id="160" w:author="Kelly, Clint Dale" w:date="2026-02-10T12:41:00Z" w16du:dateUtc="2026-02-10T17:41:00Z">
         <w:r>
           <w:t>clutch size being a consequence of the</w:t>
         </w:r>
       </w:ins>
-      <w:ins w:id="54" w:author="Kelly, Clint Dale" w:date="2026-02-10T12:39:00Z" w16du:dateUtc="2026-02-10T17:39:00Z">
+      <w:ins w:id="161" w:author="Kelly, Clint Dale" w:date="2026-02-10T12:39:00Z" w16du:dateUtc="2026-02-10T17:39:00Z">
         <w:r>
           <w:t xml:space="preserve"> </w:t>
         </w:r>
       </w:ins>
-      <w:ins w:id="55" w:author="Kelly, Clint Dale" w:date="2026-02-10T12:40:00Z" w16du:dateUtc="2026-02-10T17:40:00Z">
+      <w:ins w:id="162" w:author="Kelly, Clint Dale" w:date="2026-02-10T12:40:00Z" w16du:dateUtc="2026-02-10T17:40:00Z">
         <w:r>
           <w:t>resource</w:t>
         </w:r>
       </w:ins>
-      <w:ins w:id="56" w:author="Kelly, Clint Dale" w:date="2026-02-10T12:39:00Z" w16du:dateUtc="2026-02-10T17:39:00Z">
+      <w:ins w:id="163" w:author="Kelly, Clint Dale" w:date="2026-02-10T12:39:00Z" w16du:dateUtc="2026-02-10T17:39:00Z">
         <w:r>
           <w:t xml:space="preserve"> pool</w:t>
         </w:r>
       </w:ins>
-      <w:ins w:id="57" w:author="Kelly, Clint Dale" w:date="2026-02-10T12:41:00Z" w16du:dateUtc="2026-02-10T17:41:00Z">
+      <w:ins w:id="164" w:author="Kelly, Clint Dale" w:date="2026-02-10T12:41:00Z" w16du:dateUtc="2026-02-10T17:41:00Z">
         <w:r>
           <w:t xml:space="preserve"> size</w:t>
         </w:r>
       </w:ins>
-      <w:ins w:id="58" w:author="Kelly, Clint Dale" w:date="2026-02-10T12:40:00Z" w16du:dateUtc="2026-02-10T17:40:00Z">
+      <w:ins w:id="165" w:author="Kelly, Clint Dale" w:date="2026-02-12T16:17:00Z" w16du:dateUtc="2026-02-12T21:17:00Z">
+        <w:r>
+          <w:t>,</w:t>
+        </w:r>
+      </w:ins>
+      <w:ins w:id="166" w:author="Kelly, Clint Dale" w:date="2026-02-12T15:05:00Z" w16du:dateUtc="2026-02-12T20:05:00Z">
+        <w:r>
+          <w:t xml:space="preserve"> and that </w:t>
+        </w:r>
+      </w:ins>
+      <w:ins w:id="167" w:author="Kelly, Clint Dale" w:date="2026-02-12T15:06:00Z" w16du:dateUtc="2026-02-12T20:06:00Z">
+        <w:r>
+          <w:t xml:space="preserve">females with more functional ovarioles acquire more resources than </w:t>
+        </w:r>
+      </w:ins>
+      <w:ins w:id="168" w:author="Kelly, Clint Dale" w:date="2026-02-12T16:18:00Z" w16du:dateUtc="2026-02-12T21:18:00Z">
+        <w:r>
+          <w:t>those</w:t>
+        </w:r>
+      </w:ins>
+      <w:ins w:id="169" w:author="Kelly, Clint Dale" w:date="2026-02-12T15:06:00Z" w16du:dateUtc="2026-02-12T20:06:00Z">
+        <w:r>
+          <w:t xml:space="preserve"> with fewer</w:t>
+        </w:r>
+      </w:ins>
+      <w:ins w:id="170" w:author="Kelly, Clint Dale" w:date="2026-02-10T12:40:00Z" w16du:dateUtc="2026-02-10T17:40:00Z">
         <w:r>
           <w:t xml:space="preserve">. </w:t>
         </w:r>
       </w:ins>
-      <w:del w:id="59" w:author="Kelly, Clint Dale" w:date="2026-02-10T12:40:00Z" w16du:dateUtc="2026-02-10T17:40:00Z">
+      <w:ins w:id="171" w:author="Kelly, Clint Dale" w:date="2026-02-12T15:07:00Z" w16du:dateUtc="2026-02-12T20:07:00Z">
+        <w:r>
+          <w:t xml:space="preserve">These assumptions </w:t>
+        </w:r>
+      </w:ins>
+      <w:ins w:id="172" w:author="Kelly, Clint Dale" w:date="2026-02-12T15:14:00Z" w16du:dateUtc="2026-02-12T20:14:00Z">
+        <w:r>
+          <w:t xml:space="preserve">require </w:t>
+        </w:r>
+      </w:ins>
+      <w:ins w:id="173" w:author="Kelly, Clint Dale" w:date="2026-02-12T15:07:00Z" w16du:dateUtc="2026-02-12T20:07:00Z">
+        <w:r>
+          <w:t>empirical test</w:t>
+        </w:r>
+      </w:ins>
+      <w:ins w:id="174" w:author="Kelly, Clint Dale" w:date="2026-02-12T15:14:00Z" w16du:dateUtc="2026-02-12T20:14:00Z">
+        <w:r>
+          <w:t>ing</w:t>
+        </w:r>
+      </w:ins>
+      <w:ins w:id="175" w:author="Kelly, Clint Dale" w:date="2026-02-12T15:07:00Z" w16du:dateUtc="2026-02-12T20:07:00Z">
+        <w:r>
+          <w:t xml:space="preserve">. </w:t>
+        </w:r>
+      </w:ins>
+      <w:del w:id="176" w:author="Kelly, Clint Dale" w:date="2026-02-10T12:40:00Z" w16du:dateUtc="2026-02-10T17:40:00Z">
         <w:r>
           <w:delText>use a resource-allocation strategy for eggs that does not vary across their clutches</w:delText>
         </w:r>
@@ -1186,7 +1935,11 @@
         <w:t>F. auricularia</w:t>
       </w:r>
       <w:r>
-        <w:t xml:space="preserve"> (Koch and Meunier 2014), so egg size appears to ultimately have some positive fitness effects for the mother and offspring in this species. Therefore, the smaller earwig eggs in the second clutch by female </w:t>
+        <w:t xml:space="preserve"> (Koch and Meunier 2014), so egg size appears to ultimately have some positive fitness effects for the mother and offspring in this species. Therefore, the smaller earwig eggs </w:t>
+      </w:r>
+      <w:r>
+        <w:lastRenderedPageBreak/>
+        <w:t xml:space="preserve">in the second clutch by female </w:t>
       </w:r>
       <w:r>
         <w:rPr>
@@ -1196,7 +1949,19 @@
         <w:t>F. auricularia</w:t>
       </w:r>
       <w:r>
-        <w:t xml:space="preserve"> might have reduced fitness, except for two extenuating factors. First, maternal care in this species likely improves the survival chances of smaller eggs (Kölliker 2007; e.g., Boos et al. 2014), and the poor outcomes commonly associated with smaller nymphs might be mitigated by maternal provisioning (Staerkle and Kölliker 2008). Second, smaller eggs tend to hatch faster as development time is positively related to egg size across animal species (Shine 1978). This would be advantageous if a second clutch is produced later in the reproductive season, such as mid-winter, because it would mean the eggs would hatch at a time of year (e.g., late-winter) that allows nymphs to emerge at an optimal time in spring. Empirical evidence, however, suggests that time-to-hatch is unrelated to egg mass in at least one (Italian) population of </w:t>
+        <w:t xml:space="preserve"> might have reduced fitness, except for two extenuating factors. First, maternal care in this species likely improves the survival chances of smaller eggs (</w:t>
+      </w:r>
+      <w:r>
+        <w:rPr>
+          <w:highlight w:val="yellow"/>
+          <w:rPrChange w:id="177" w:author="Kelly, Clint Dale" w:date="2026-02-12T14:23:00Z" w16du:dateUtc="2026-02-12T19:23:00Z">
+            <w:rPr/>
+          </w:rPrChange>
+        </w:rPr>
+        <w:t>Kölliker 2007; e.g., Boos et al. 2014</w:t>
+      </w:r>
+      <w:r>
+        <w:t xml:space="preserve">), and the poor outcomes commonly associated with smaller nymphs might be mitigated by maternal provisioning (Staerkle and Kölliker 2008). Second, smaller eggs tend to hatch faster as development time is positively related to egg size across animal species (Shine 1978). This would be advantageous if a second clutch is produced later in the reproductive season, such as mid-winter, because it would mean the eggs would hatch at a time of year (e.g., late-winter) that allows nymphs to emerge at an optimal time in spring. Empirical evidence, however, suggests that time-to-hatch is unrelated to egg mass in at least one (Italian) population of </w:t>
       </w:r>
       <w:r>
         <w:rPr>
@@ -1206,12 +1971,109 @@
         <w:t>F. auricularia</w:t>
       </w:r>
       <w:r>
-        <w:t xml:space="preserve"> (Koch and Meunier 2014). This latter population, however, is from a more temperate locale than Montreal, which experiences a milder climate and thus perhaps less intense selection on reduced development time. I did not find the predicted positive among-female correlation between clutch and egg size. Rather, the weak negative among-individual correlation between clutch and egg size suggests that variance in resource allocation may exceed variance in </w:t>
-      </w:r>
-      <w:r>
-        <w:lastRenderedPageBreak/>
-        <w:t>resource acquisition in this population of earwigs (see Careau and Wilson 2017). In other words, some female earwigs in my study population might prioritise investment in egg number versus egg size and vice versa. Taken together, my results resemble Careau and Wilson’s (2017) “sink or swim” scenario, which is generally reserved for performance trade-offs. That is, females in my population of earwigs might ultimately produce an among-female (albeit weak) trade-off due to differences among females in how they allocate resources to clutch and egg size, with some females prioritising egg number over size, while also producing a positive residual correlation due to a combination of ovary (dis)function, and the equal apportionment of fewer resources to eggs. Further research is needed to identify the proximate mechanisms underlying the observed multilevel correlation patterns.</w:t>
-      </w:r>
+        <w:t xml:space="preserve"> (Koch and Meunier 2014). This latter population, however, is from a more temperate locale than Montreal, </w:t>
+      </w:r>
+      <w:del w:id="178" w:author="Kelly, Clint Dale" w:date="2026-02-12T16:16:00Z" w16du:dateUtc="2026-02-12T21:16:00Z">
+        <w:r>
+          <w:delText xml:space="preserve">which </w:delText>
+        </w:r>
+      </w:del>
+      <w:ins w:id="179" w:author="Kelly, Clint Dale" w:date="2026-02-12T16:16:00Z" w16du:dateUtc="2026-02-12T21:16:00Z">
+        <w:r>
+          <w:t>and</w:t>
+        </w:r>
+        <w:r>
+          <w:t xml:space="preserve"> </w:t>
+        </w:r>
+      </w:ins>
+      <w:r>
+        <w:t>experiences a milder climate and thus perhaps less intense selection on reduced development time.</w:t>
+      </w:r>
+      <w:bookmarkStart w:id="180" w:name="_Hlk221805943"/>
+      <w:ins w:id="181" w:author="Kelly, Clint Dale" w:date="2026-02-12T16:26:00Z" w16du:dateUtc="2026-02-12T21:26:00Z">
+        <w:r>
+          <w:rPr>
+            <w:rFonts w:ascii="-webkit-standard" w:hAnsi="-webkit-standard"/>
+            <w:color w:val="000000"/>
+            <w:sz w:val="27"/>
+            <w:szCs w:val="27"/>
+          </w:rPr>
+          <w:t xml:space="preserve"> </w:t>
+        </w:r>
+      </w:ins>
+      <w:ins w:id="182" w:author="Kelly, Clint Dale" w:date="2026-02-12T16:26:00Z">
+        <w:r>
+          <w:t>Further research is needed to determine the ultimate consequences of females producing smaller clutches with smaller eggs. This question is becoming increasingly important, as climate warming may allow semelparous populations in Montreal-like climates to produce second clutches more frequently.</w:t>
+        </w:r>
+      </w:ins>
+      <w:del w:id="183" w:author="Kelly, Clint Dale" w:date="2026-02-12T16:26:00Z" w16du:dateUtc="2026-02-12T21:26:00Z">
+        <w:r>
+          <w:delText xml:space="preserve"> </w:delText>
+        </w:r>
+      </w:del>
+      <w:bookmarkEnd w:id="180"/>
+      <w:del w:id="184" w:author="Kelly, Clint Dale" w:date="2026-02-12T16:17:00Z" w16du:dateUtc="2026-02-12T21:17:00Z">
+        <w:r>
+          <w:delText xml:space="preserve">I did not find the predicted positive among-female correlation between clutch and egg size. </w:delText>
+        </w:r>
+        <w:r>
+          <w:rPr>
+            <w:color w:val="EE0000"/>
+            <w:rPrChange w:id="185" w:author="Kelly, Clint Dale" w:date="2026-02-12T16:15:00Z" w16du:dateUtc="2026-02-12T21:15:00Z">
+              <w:rPr/>
+            </w:rPrChange>
+          </w:rPr>
+          <w:delText xml:space="preserve">Rather, the </w:delText>
+        </w:r>
+      </w:del>
+      <w:del w:id="186" w:author="Kelly, Clint Dale" w:date="2026-02-12T16:04:00Z" w16du:dateUtc="2026-02-12T21:04:00Z">
+        <w:r>
+          <w:rPr>
+            <w:color w:val="EE0000"/>
+            <w:rPrChange w:id="187" w:author="Kelly, Clint Dale" w:date="2026-02-12T16:15:00Z" w16du:dateUtc="2026-02-12T21:15:00Z">
+              <w:rPr/>
+            </w:rPrChange>
+          </w:rPr>
+          <w:delText>weak negative</w:delText>
+        </w:r>
+      </w:del>
+      <w:del w:id="188" w:author="Kelly, Clint Dale" w:date="2026-02-12T16:17:00Z" w16du:dateUtc="2026-02-12T21:17:00Z">
+        <w:r>
+          <w:rPr>
+            <w:color w:val="EE0000"/>
+            <w:rPrChange w:id="189" w:author="Kelly, Clint Dale" w:date="2026-02-12T16:15:00Z" w16du:dateUtc="2026-02-12T21:15:00Z">
+              <w:rPr/>
+            </w:rPrChange>
+          </w:rPr>
+          <w:delText xml:space="preserve"> among-individual correlation between clutch and egg size suggests that variance in resource allocation may exceed variance in resource acquisition in this population of earwigs (see Careau and Wilson 2017). In other words, some female earwigs in my study population might prioritise investment in egg number versus egg size and vice versa. </w:delText>
+        </w:r>
+        <w:r>
+          <w:rPr>
+            <w:color w:val="EE0000"/>
+            <w:highlight w:val="yellow"/>
+            <w:rPrChange w:id="190" w:author="Kelly, Clint Dale" w:date="2026-02-12T16:15:00Z" w16du:dateUtc="2026-02-12T21:15:00Z">
+              <w:rPr/>
+            </w:rPrChange>
+          </w:rPr>
+          <w:delText>Taken together, my results resemble Careau and Wilson’s (2017) “sink or swim” scenario, which is generally reserved for performance trade-offs.</w:delText>
+        </w:r>
+        <w:r>
+          <w:rPr>
+            <w:color w:val="EE0000"/>
+            <w:rPrChange w:id="191" w:author="Kelly, Clint Dale" w:date="2026-02-12T16:15:00Z" w16du:dateUtc="2026-02-12T21:15:00Z">
+              <w:rPr/>
+            </w:rPrChange>
+          </w:rPr>
+          <w:delText xml:space="preserve"> </w:delText>
+        </w:r>
+        <w:r>
+          <w:delText xml:space="preserve">That is, females in my population of earwigs might ultimately produce an among-female (albeit weak) trade-off due to differences among females in how they allocate resources to clutch and egg size, with some females prioritising egg number over </w:delText>
+        </w:r>
+        <w:r>
+          <w:lastRenderedPageBreak/>
+          <w:delText>size, while also producing a positive residual correlation due to a combination of ovary (dis)function, and the equal apportionment of fewer resources to eggs. Further research is needed to identify the proximate mechanisms underlying the observed multilevel correlation patterns.</w:delText>
+        </w:r>
+      </w:del>
     </w:p>
     <w:p>
       <w:pPr>
@@ -1258,8 +2120,21 @@
         <w:t>Choristoneura fumiferana</w:t>
       </w:r>
       <w:r>
-        <w:t>) (Harvey 1983). Moreover, the lack of between-female variation in average egg size between first and second clutches suggests that the food-acquisition environment (i.e. wild vs. lab) had little effect on average egg size.</w:t>
-      </w:r>
+        <w:t xml:space="preserve">) (Harvey 1983). </w:t>
+      </w:r>
+      <w:bookmarkStart w:id="192" w:name="_Hlk221800841"/>
+      <w:del w:id="193" w:author="Kelly, Clint Dale" w:date="2026-02-12T17:06:00Z" w16du:dateUtc="2026-02-12T22:06:00Z">
+        <w:r>
+          <w:rPr>
+            <w:highlight w:val="yellow"/>
+            <w:rPrChange w:id="194" w:author="Kelly, Clint Dale" w:date="2026-02-12T14:59:00Z" w16du:dateUtc="2026-02-12T19:59:00Z">
+              <w:rPr/>
+            </w:rPrChange>
+          </w:rPr>
+          <w:delText>Moreover, the lack of between-female variation in average egg size between first and second clutches suggests that the food-acquisition environment (i.e. wild vs. lab) had little effect on average egg size.</w:delText>
+        </w:r>
+      </w:del>
+      <w:bookmarkEnd w:id="192"/>
     </w:p>
     <w:p>
       <w:pPr>
@@ -1276,11 +2151,7 @@
         <w:t>Rhodopsiza obsoleta</w:t>
       </w:r>
       <w:r>
-        <w:t xml:space="preserve">) produced similar-sized eggs when environmental conditions were </w:t>
-      </w:r>
-      <w:r>
-        <w:lastRenderedPageBreak/>
-        <w:t>stable (Yosef and Zduniak 2008), collared flycatchers (</w:t>
+        <w:t>) produced similar-sized eggs when environmental conditions were stable (Yosef and Zduniak 2008), collared flycatchers (</w:t>
       </w:r>
       <w:r>
         <w:rPr>
@@ -1292,15 +2163,77 @@
       <w:r>
         <w:t>) produced larger eggs with the laying sequence in favourable conditions (Hargitai et al. 2005), and blue tits (</w:t>
       </w:r>
+      <w:del w:id="195" w:author="Kelly, Clint Dale" w:date="2026-02-12T17:15:00Z" w16du:dateUtc="2026-02-12T22:15:00Z">
+        <w:r>
+          <w:rPr>
+            <w:i/>
+            <w:iCs/>
+          </w:rPr>
+          <w:delText xml:space="preserve">Paris </w:delText>
+        </w:r>
+      </w:del>
+      <w:ins w:id="196" w:author="Kelly, Clint Dale" w:date="2026-02-12T17:15:00Z" w16du:dateUtc="2026-02-12T22:15:00Z">
+        <w:r>
+          <w:rPr>
+            <w:i/>
+            <w:iCs/>
+          </w:rPr>
+          <w:t>Par</w:t>
+        </w:r>
+        <w:r>
+          <w:rPr>
+            <w:i/>
+            <w:iCs/>
+          </w:rPr>
+          <w:t>u</w:t>
+        </w:r>
+        <w:r>
+          <w:rPr>
+            <w:i/>
+            <w:iCs/>
+          </w:rPr>
+          <w:t xml:space="preserve">s </w:t>
+        </w:r>
+      </w:ins>
       <w:r>
         <w:rPr>
           <w:i/>
           <w:iCs/>
         </w:rPr>
-        <w:t>Paris caeruleus</w:t>
-      </w:r>
-      <w:r>
-        <w:t>) in better nutritional condition had clutches with less variation in egg size (Nilsson and Svensson 1993). Although information on intraclutch egg-size variation and its proximal drivers is scarce in insects, the same principles may apply, given that female earwigs in my study had less time to accumulate resources and maximise their body condition before producing their second clutch. If true, then females might have allocated resources maximally to the eggs in their first clutch, following an individual allocation strategy based on intrinsic factors such as body condition. This strategy would produce individual-specific egg sizes that are consistent across eggs within a clutch. In second clutches, by contrast, females might have allocated an optimal (but smaller) amount of resources to each oocyte until the last few oocytes, when they had fewer resources remaining and thus produced a few significantly smaller eggs. I did not record laying order in this study and therefore cannot assess whether larger eggs were laid first or last. Within-clutch variation in egg size is adaptive in birds. For example, larger eggs later in the egg-laying sequence may be a brood-survival strategy that counteracts the effects of hatching asynchrony, whereas smaller eggs later in the laying sequence may be a brood-reduction strategy (Slagsvold et al. 1984). However, it is unknown whether variation in egg size has an equivalent adaptive function in insects expressing maternal care.</w:t>
+        <w:t>caeruleus</w:t>
+      </w:r>
+      <w:r>
+        <w:t xml:space="preserve">) in better nutritional condition had clutches with less variation in egg size (Nilsson and Svensson 1993). Although information on intraclutch egg-size variation and its proximal drivers is scarce in insects, the same principles may apply, given that female earwigs in my study had less time to accumulate resources and maximise their body condition </w:t>
+      </w:r>
+      <w:r>
+        <w:lastRenderedPageBreak/>
+        <w:t xml:space="preserve">before producing their second clutch. If true, then females might have allocated resources maximally to the eggs in their first clutch, following an individual allocation strategy based on intrinsic factors such as body condition. This strategy would produce individual-specific egg sizes that are consistent across eggs within a clutch. In second clutches, by contrast, females might have allocated an optimal (but smaller) amount of resources to each oocyte until the last few oocytes, when they had fewer resources remaining and thus produced a few significantly smaller eggs. I did not record laying order in this study and therefore cannot assess whether larger eggs were laid first or last. Within-clutch variation in egg size is adaptive in birds. For example, larger eggs later in the egg-laying sequence may be a brood-survival strategy that counteracts the effects of hatching asynchrony, whereas smaller eggs later in the laying sequence may be a brood-reduction strategy (Slagsvold et al. 1984). However, it is unknown whether variation in egg size </w:t>
+      </w:r>
+      <w:del w:id="197" w:author="Kelly, Clint Dale" w:date="2026-02-12T17:16:00Z" w16du:dateUtc="2026-02-12T22:16:00Z">
+        <w:r>
+          <w:delText>ha</w:delText>
+        </w:r>
+      </w:del>
+      <w:ins w:id="198" w:author="Kelly, Clint Dale" w:date="2026-02-12T17:16:00Z" w16du:dateUtc="2026-02-12T22:16:00Z">
+        <w:r>
+          <w:t>serve</w:t>
+        </w:r>
+      </w:ins>
+      <w:r>
+        <w:t xml:space="preserve">s an equivalent adaptive function in insects </w:t>
+      </w:r>
+      <w:del w:id="199" w:author="Kelly, Clint Dale" w:date="2026-02-12T17:16:00Z" w16du:dateUtc="2026-02-12T22:16:00Z">
+        <w:r>
+          <w:delText>expressing</w:delText>
+        </w:r>
+      </w:del>
+      <w:ins w:id="200" w:author="Kelly, Clint Dale" w:date="2026-02-12T17:16:00Z" w16du:dateUtc="2026-02-12T22:16:00Z">
+        <w:r>
+          <w:t>that express</w:t>
+        </w:r>
+      </w:ins>
+      <w:r>
+        <w:t xml:space="preserve"> maternal care.</w:t>
       </w:r>
     </w:p>
     <w:p>
@@ -1308,18 +2241,97 @@
         <w:pStyle w:val="BodyText"/>
       </w:pPr>
       <w:r>
-        <w:t>In conclusion, by partitioning variance into its among- and within-individual components, I found that female European earwigs do not trade off clutch and egg size. Instead, I found a positive correlation between egg number and size and some evidence for an among-female trade-off. I also discovered that second clutches consist of eggs with a more variable size than first clutches, but the among-female variation in average egg size was similar between the two clutches.</w:t>
+        <w:t xml:space="preserve">In conclusion, by partitioning variance into its among- and within-individual components, I found that female European earwigs do not trade off clutch and egg size. Instead, I found a positive correlation between egg number and size </w:t>
+      </w:r>
+      <w:del w:id="201" w:author="Kelly, Clint Dale" w:date="2026-02-13T14:58:00Z" w16du:dateUtc="2026-02-13T19:58:00Z">
+        <w:r>
+          <w:delText>and some evidence for an among-female trade-off</w:delText>
+        </w:r>
+      </w:del>
+      <w:ins w:id="202" w:author="Kelly, Clint Dale" w:date="2026-02-13T14:58:00Z" w16du:dateUtc="2026-02-13T19:58:00Z">
+        <w:r>
+          <w:t>within females</w:t>
+        </w:r>
+      </w:ins>
+      <w:r>
+        <w:t>.</w:t>
+      </w:r>
+      <w:ins w:id="203" w:author="Kelly, Clint Dale" w:date="2026-02-13T14:58:00Z" w16du:dateUtc="2026-02-13T19:58:00Z">
+        <w:r>
+          <w:t xml:space="preserve"> </w:t>
+        </w:r>
+      </w:ins>
+      <w:bookmarkStart w:id="204" w:name="_Hlk221887479"/>
+      <w:ins w:id="205" w:author="Kelly, Clint Dale" w:date="2026-02-13T15:05:00Z">
+        <w:r>
+          <w:t xml:space="preserve">My results suggest that proximate mechanisms may </w:t>
+        </w:r>
+      </w:ins>
+      <w:ins w:id="206" w:author="Kelly, Clint Dale" w:date="2026-02-13T15:05:00Z" w16du:dateUtc="2026-02-13T20:05:00Z">
+        <w:r>
+          <w:t>constrain</w:t>
+        </w:r>
+      </w:ins>
+      <w:ins w:id="207" w:author="Kelly, Clint Dale" w:date="2026-02-13T15:05:00Z">
+        <w:r>
+          <w:t xml:space="preserve"> individuals’ ability to make trade-offs, such as when resources are equally allocated among eggs </w:t>
+        </w:r>
+      </w:ins>
+      <w:ins w:id="208" w:author="Kelly, Clint Dale" w:date="2026-02-13T15:06:00Z" w16du:dateUtc="2026-02-13T20:06:00Z">
+        <w:r>
+          <w:t>and</w:t>
+        </w:r>
+      </w:ins>
+      <w:ins w:id="209" w:author="Kelly, Clint Dale" w:date="2026-02-13T15:05:00Z">
+        <w:r>
+          <w:t xml:space="preserve"> females possess limited resource </w:t>
+        </w:r>
+        <w:proofErr w:type="spellStart"/>
+        <w:r>
+          <w:t>reserves.</w:t>
+        </w:r>
+      </w:ins>
+      <w:del w:id="210" w:author="Kelly, Clint Dale" w:date="2026-02-13T15:01:00Z" w16du:dateUtc="2026-02-13T20:01:00Z">
+        <w:r>
+          <w:delText xml:space="preserve"> </w:delText>
+        </w:r>
+      </w:del>
+      <w:bookmarkEnd w:id="204"/>
+      <w:r>
+        <w:t>I</w:t>
+      </w:r>
+      <w:proofErr w:type="spellEnd"/>
+      <w:r>
+        <w:t xml:space="preserve"> also discovered that second clutches consist of eggs with a more variable size than first clutches, but the among-female variation in average egg size was similar between the two clutches.</w:t>
       </w:r>
     </w:p>
     <w:p>
       <w:pPr>
         <w:pStyle w:val="Heading1"/>
       </w:pPr>
-      <w:bookmarkStart w:id="60" w:name="data-availability"/>
-      <w:bookmarkEnd w:id="39"/>
+      <w:bookmarkStart w:id="211" w:name="data-availability"/>
+      <w:bookmarkEnd w:id="123"/>
+      <w:r>
+        <w:t>Data availability</w:t>
+      </w:r>
+    </w:p>
+    <w:p>
+      <w:pPr>
+        <w:pStyle w:val="FirstParagraph"/>
+      </w:pPr>
+      <w:r>
+        <w:t>Data are available through the OSF repository at 10.17605/OSF.IO/MFJ8E.</w:t>
+      </w:r>
+    </w:p>
+    <w:p>
+      <w:pPr>
+        <w:pStyle w:val="Heading1"/>
+      </w:pPr>
+      <w:bookmarkStart w:id="212" w:name="author-contributions"/>
+      <w:bookmarkEnd w:id="211"/>
       <w:r>
         <w:lastRenderedPageBreak/>
-        <w:t>Data availability</w:t>
+        <w:t>Author contributions</w:t>
       </w:r>
     </w:p>
     <w:p>
@@ -1327,17 +2339,17 @@
         <w:pStyle w:val="FirstParagraph"/>
       </w:pPr>
       <w:r>
-        <w:t>Data are available through the OSF repository at 10.17605/OSF.IO/MFJ8E.</w:t>
+        <w:t>CDK collected and analyzed the data, and wrote the manuscript.</w:t>
       </w:r>
     </w:p>
     <w:p>
       <w:pPr>
         <w:pStyle w:val="Heading1"/>
       </w:pPr>
-      <w:bookmarkStart w:id="61" w:name="author-contributions"/>
-      <w:bookmarkEnd w:id="60"/>
-      <w:r>
-        <w:t>Author contributions</w:t>
+      <w:bookmarkStart w:id="213" w:name="funding"/>
+      <w:bookmarkEnd w:id="212"/>
+      <w:r>
+        <w:t>Funding</w:t>
       </w:r>
     </w:p>
     <w:p>
@@ -1345,17 +2357,17 @@
         <w:pStyle w:val="FirstParagraph"/>
       </w:pPr>
       <w:r>
-        <w:t>CDK collected and analyzed the data, and wrote the manuscript.</w:t>
+        <w:t>The study was funded by a Discovery Grant from the Natural Sciences and Engineering Research Council of Canada (NSERC).</w:t>
       </w:r>
     </w:p>
     <w:p>
       <w:pPr>
         <w:pStyle w:val="Heading1"/>
       </w:pPr>
-      <w:bookmarkStart w:id="62" w:name="funding"/>
-      <w:bookmarkEnd w:id="61"/>
-      <w:r>
-        <w:t>Funding</w:t>
+      <w:bookmarkStart w:id="214" w:name="conflict-of-interest"/>
+      <w:bookmarkEnd w:id="213"/>
+      <w:r>
+        <w:t>Conflict of Interest</w:t>
       </w:r>
     </w:p>
     <w:p>
@@ -1363,17 +2375,17 @@
         <w:pStyle w:val="FirstParagraph"/>
       </w:pPr>
       <w:r>
-        <w:t>The study was funded by a Discovery Grant from the Natural Sciences and Engineering Research Council of Canada (NSERC).</w:t>
+        <w:t>I declare no conflict of interest.</w:t>
       </w:r>
     </w:p>
     <w:p>
       <w:pPr>
         <w:pStyle w:val="Heading1"/>
       </w:pPr>
-      <w:bookmarkStart w:id="63" w:name="conflict-of-interest"/>
-      <w:bookmarkEnd w:id="62"/>
-      <w:r>
-        <w:t>Conflict of Interest</w:t>
+      <w:bookmarkStart w:id="215" w:name="acknowledgements"/>
+      <w:bookmarkEnd w:id="214"/>
+      <w:r>
+        <w:t>Acknowledgements</w:t>
       </w:r>
     </w:p>
     <w:p>
@@ -1381,38 +2393,20 @@
         <w:pStyle w:val="FirstParagraph"/>
       </w:pPr>
       <w:r>
-        <w:t>I declare no conflict of interest.</w:t>
+        <w:t>I thank Andréanne Nault and Clara Smythe for assistance in animal care and data collection.</w:t>
+      </w:r>
+    </w:p>
+    <w:p>
+      <w:r>
+        <w:br w:type="page"/>
       </w:r>
     </w:p>
     <w:p>
       <w:pPr>
         <w:pStyle w:val="Heading1"/>
       </w:pPr>
-      <w:bookmarkStart w:id="64" w:name="acknowledgements"/>
-      <w:bookmarkEnd w:id="63"/>
-      <w:r>
-        <w:t>Acknowledgements</w:t>
-      </w:r>
-    </w:p>
-    <w:p>
-      <w:pPr>
-        <w:pStyle w:val="FirstParagraph"/>
-      </w:pPr>
-      <w:r>
-        <w:t>I thank Andréanne Nault and Clara Smythe for assistance in animal care and data collection.</w:t>
-      </w:r>
-    </w:p>
-    <w:p>
-      <w:r>
-        <w:br w:type="page"/>
-      </w:r>
-    </w:p>
-    <w:p>
-      <w:pPr>
-        <w:pStyle w:val="Heading1"/>
-      </w:pPr>
-      <w:bookmarkStart w:id="65" w:name="references"/>
-      <w:bookmarkEnd w:id="64"/>
+      <w:bookmarkStart w:id="216" w:name="references"/>
+      <w:bookmarkEnd w:id="215"/>
       <w:r>
         <w:lastRenderedPageBreak/>
         <w:t>References</w:t>
@@ -1422,8 +2416,8 @@
       <w:pPr>
         <w:pStyle w:val="Bibliography"/>
       </w:pPr>
-      <w:bookmarkStart w:id="66" w:name="ref-bernardo1996"/>
-      <w:bookmarkStart w:id="67" w:name="refs"/>
+      <w:bookmarkStart w:id="217" w:name="ref-bernardo1996"/>
+      <w:bookmarkStart w:id="218" w:name="refs"/>
       <w:r>
         <w:t>Bernardo, J. 1996. The particular maternal effect of propagule size, especially egg size: Patterns, models, quality of evidence and interpretations. Am Zool 36:216–236.</w:t>
       </w:r>
@@ -1432,8 +2426,8 @@
       <w:pPr>
         <w:pStyle w:val="Bibliography"/>
       </w:pPr>
-      <w:bookmarkStart w:id="68" w:name="ref-boos2014"/>
-      <w:bookmarkEnd w:id="66"/>
+      <w:bookmarkStart w:id="219" w:name="ref-boos2014"/>
+      <w:bookmarkEnd w:id="217"/>
       <w:r>
         <w:t>Boos, S., J. Meunier, S. Pichon, and M. Kölliker. 2014. Maternal care provides antifungal protection to eggs in the european earwig. Behav Ecol 25:754–761.</w:t>
       </w:r>
@@ -1442,8 +2436,8 @@
       <w:pPr>
         <w:pStyle w:val="Bibliography"/>
       </w:pPr>
-      <w:bookmarkStart w:id="69" w:name="ref-burkner2017"/>
-      <w:bookmarkEnd w:id="68"/>
+      <w:bookmarkStart w:id="220" w:name="ref-burkner2017"/>
+      <w:bookmarkEnd w:id="219"/>
       <w:r>
         <w:t>Bürkner, P.-C. 2017. brms: An R package for Bayesian multilevel models using Stan. Journal of Statistical Software 80:4308.</w:t>
       </w:r>
@@ -1452,8 +2446,8 @@
       <w:pPr>
         <w:pStyle w:val="Bibliography"/>
       </w:pPr>
-      <w:bookmarkStart w:id="70" w:name="ref-careau2017"/>
-      <w:bookmarkEnd w:id="69"/>
+      <w:bookmarkStart w:id="221" w:name="ref-careau2017"/>
+      <w:bookmarkEnd w:id="220"/>
       <w:r>
         <w:t>Careau, V., and R. Wilson. 2017. Of uberfleas and krakens: Detecting trade-offs using mixed models. Integr Comp Biol 57:362–371.</w:t>
       </w:r>
@@ -1462,8 +2456,8 @@
       <w:pPr>
         <w:pStyle w:val="Bibliography"/>
       </w:pPr>
-      <w:bookmarkStart w:id="71" w:name="ref-cavaleiro2014"/>
-      <w:bookmarkEnd w:id="70"/>
+      <w:bookmarkStart w:id="222" w:name="ref-cavaleiro2014"/>
+      <w:bookmarkEnd w:id="221"/>
       <w:r>
         <w:t>Cavaleiro, F. I., and M. J. Santos. 2014. Egg number-egg size: An important trade-off in parasite life history strategies. Int J Parasitol 44:173–182.</w:t>
       </w:r>
@@ -1472,8 +2466,8 @@
       <w:pPr>
         <w:pStyle w:val="Bibliography"/>
       </w:pPr>
-      <w:bookmarkStart w:id="72" w:name="ref-church2019"/>
-      <w:bookmarkEnd w:id="71"/>
+      <w:bookmarkStart w:id="223" w:name="ref-church2019"/>
+      <w:bookmarkEnd w:id="222"/>
       <w:r>
         <w:t>Church, S. H., S. Donoughe, B. A. S. de Medeiros, and C. G. Extavour. 2019. Insect egg size and shape evolve with ecology but not developmental rate. Nature 571:58–62.</w:t>
       </w:r>
@@ -1482,8 +2476,8 @@
       <w:pPr>
         <w:pStyle w:val="Bibliography"/>
       </w:pPr>
-      <w:bookmarkStart w:id="73" w:name="ref-clutton-brock1984"/>
-      <w:bookmarkEnd w:id="72"/>
+      <w:bookmarkStart w:id="224" w:name="ref-clutton-brock1984"/>
+      <w:bookmarkEnd w:id="223"/>
       <w:r>
         <w:t>Clutton-Brock, T. H. 1984. Reproductive effort and terminal investment in iteroparous animals. Am Nat 123:212–229.</w:t>
       </w:r>
@@ -1492,8 +2486,8 @@
       <w:pPr>
         <w:pStyle w:val="Bibliography"/>
       </w:pPr>
-      <w:bookmarkStart w:id="74" w:name="ref-clutton-brock1991"/>
-      <w:bookmarkEnd w:id="73"/>
+      <w:bookmarkStart w:id="225" w:name="ref-clutton-brock1991"/>
+      <w:bookmarkEnd w:id="224"/>
       <w:r>
         <w:t>Clutton-Brock, T. H. 1991. The Evolution of Parental Care. Princeton University Press.</w:t>
       </w:r>
@@ -1502,8 +2496,8 @@
       <w:pPr>
         <w:pStyle w:val="Bibliography"/>
       </w:pPr>
-      <w:bookmarkStart w:id="75" w:name="ref-einum2000"/>
-      <w:bookmarkEnd w:id="74"/>
+      <w:bookmarkStart w:id="226" w:name="ref-einum2000"/>
+      <w:bookmarkEnd w:id="225"/>
       <w:r>
         <w:t>Einum, S., and I. A. Fleming. 2000. Highly fecund mothers sacrifice offspring survival to maximize fitness. Nature 405:565–567.</w:t>
       </w:r>
@@ -1512,8 +2506,8 @@
       <w:pPr>
         <w:pStyle w:val="Bibliography"/>
       </w:pPr>
-      <w:bookmarkStart w:id="76" w:name="ref-falconer1996"/>
-      <w:bookmarkEnd w:id="75"/>
+      <w:bookmarkStart w:id="227" w:name="ref-falconer1996"/>
+      <w:bookmarkEnd w:id="226"/>
       <w:r>
         <w:t>Falconer, D. S., and T. F. C. MacKay. 1996. An Introduction Quantitative Genetics. Pearson Education Limited, Essex, England.</w:t>
       </w:r>
@@ -1522,8 +2516,8 @@
       <w:pPr>
         <w:pStyle w:val="Bibliography"/>
       </w:pPr>
-      <w:bookmarkStart w:id="77" w:name="ref-ficetola2009"/>
-      <w:bookmarkEnd w:id="76"/>
+      <w:bookmarkStart w:id="228" w:name="ref-ficetola2009"/>
+      <w:bookmarkEnd w:id="227"/>
       <w:r>
         <w:t>Ficetola, G. F., and F. De Bernardi. 2009. Offspring size and survival in the frog rana latastei: From among-population to within-clutch variation. Biol J Linn Soc 97:845–853.</w:t>
       </w:r>
@@ -1532,8 +2526,8 @@
       <w:pPr>
         <w:pStyle w:val="Bibliography"/>
       </w:pPr>
-      <w:bookmarkStart w:id="78" w:name="ref-fox2000"/>
-      <w:bookmarkEnd w:id="77"/>
+      <w:bookmarkStart w:id="229" w:name="ref-fox2000"/>
+      <w:bookmarkEnd w:id="228"/>
       <w:r>
         <w:t>Fox, C. W., and M. E. Czesak. 2000. Evolutionary ecology of progeny size in arthropods. Annu Rev Entomol 45:341–369.</w:t>
       </w:r>
@@ -1542,8 +2536,8 @@
       <w:pPr>
         <w:pStyle w:val="Bibliography"/>
       </w:pPr>
-      <w:bookmarkStart w:id="79" w:name="ref-hargitai2005"/>
-      <w:bookmarkEnd w:id="78"/>
+      <w:bookmarkStart w:id="230" w:name="ref-hargitai2005"/>
+      <w:bookmarkEnd w:id="229"/>
       <w:r>
         <w:t>Hargitai, R., J. Török, L. Tóth, G. Hegyi, B. Rosivall, B. Szigeti, and E. Szöllősi. 2005. Effects of environmental conditions and parental quality on inter-and intraclutch egg-size variation in the collared flycatcher (ficedula albicollis). The Auk 122:509–522.</w:t>
       </w:r>
@@ -1552,8 +2546,8 @@
       <w:pPr>
         <w:pStyle w:val="Bibliography"/>
       </w:pPr>
-      <w:bookmarkStart w:id="80" w:name="ref-harvey1983"/>
-      <w:bookmarkEnd w:id="79"/>
+      <w:bookmarkStart w:id="231" w:name="ref-harvey1983"/>
+      <w:bookmarkEnd w:id="230"/>
       <w:r>
         <w:t>Harvey, G. T. 1983. Environmental and genetic effects on mean egg weight in spruce budworm (lepidoptera: tortricidae). The Canadian Entomologist 115:1109–1117.</w:t>
       </w:r>
@@ -1562,8 +2556,8 @@
       <w:pPr>
         <w:pStyle w:val="Bibliography"/>
       </w:pPr>
-      <w:bookmarkStart w:id="81" w:name="ref-honek1993"/>
-      <w:bookmarkEnd w:id="80"/>
+      <w:bookmarkStart w:id="232" w:name="ref-honek1993"/>
+      <w:bookmarkEnd w:id="231"/>
       <w:r>
         <w:t>Honek, A. 1993. Intraspecific variation in body size and fecundity in insects: A general relationship. Oikos 483–492.</w:t>
       </w:r>
@@ -1572,8 +2566,8 @@
       <w:pPr>
         <w:pStyle w:val="Bibliography"/>
       </w:pPr>
-      <w:bookmarkStart w:id="82" w:name="ref-kelly2014"/>
-      <w:bookmarkEnd w:id="81"/>
+      <w:bookmarkStart w:id="233" w:name="ref-kelly2014"/>
+      <w:bookmarkEnd w:id="232"/>
       <w:r>
         <w:t>Kelly, C. D., B. Tawes, and A. Worthington. 2014. Evaluating indices of body condition in two cricket species. Ecology and Evolution 4:4476–4487.</w:t>
       </w:r>
@@ -1582,8 +2576,8 @@
       <w:pPr>
         <w:pStyle w:val="Bibliography"/>
       </w:pPr>
-      <w:bookmarkStart w:id="83" w:name="ref-koch2014"/>
-      <w:bookmarkEnd w:id="82"/>
+      <w:bookmarkStart w:id="234" w:name="ref-koch2014"/>
+      <w:bookmarkEnd w:id="233"/>
       <w:r>
         <w:t>Koch, L. K., and J. Meunier. 2014. Mother and offspring fitness in an insect with maternal care: Phenotypic trade-offs between egg number, egg mass and egg care. BMC Evol Biol 14:125.</w:t>
       </w:r>
@@ -1592,8 +2586,8 @@
       <w:pPr>
         <w:pStyle w:val="Bibliography"/>
       </w:pPr>
-      <w:bookmarkStart w:id="84" w:name="ref-kolliker2007"/>
-      <w:bookmarkEnd w:id="83"/>
+      <w:bookmarkStart w:id="235" w:name="ref-kolliker2007"/>
+      <w:bookmarkEnd w:id="234"/>
       <w:r>
         <w:lastRenderedPageBreak/>
         <w:t>Kölliker, M. 2007. Benefits and costs of earwig (forficula auricularia) family life. Behav Ecol Sociobiol 61:1489–1497.</w:t>
@@ -1603,8 +2597,8 @@
       <w:pPr>
         <w:pStyle w:val="Bibliography"/>
       </w:pPr>
-      <w:bookmarkStart w:id="85" w:name="ref-meunier2024"/>
-      <w:bookmarkEnd w:id="84"/>
+      <w:bookmarkStart w:id="236" w:name="ref-meunier2024"/>
+      <w:bookmarkEnd w:id="235"/>
       <w:r>
         <w:t>Meunier, J. 2024. The biology and social life of earwigs (dermaptera). Annu Rev Entomol 69:259–276.</w:t>
       </w:r>
@@ -1613,8 +2607,8 @@
       <w:pPr>
         <w:pStyle w:val="Bibliography"/>
       </w:pPr>
-      <w:bookmarkStart w:id="86" w:name="ref-nelson2004"/>
-      <w:bookmarkEnd w:id="85"/>
+      <w:bookmarkStart w:id="237" w:name="ref-nelson2004"/>
+      <w:bookmarkEnd w:id="236"/>
       <w:r>
         <w:t>Nelson, N. J., M. B. Thompson, S. Pledger, S. N. Keall, and C. H. Daugherty. 2004. Egg mass determines hatchling size, and incubation temperature influences post‐hatching growth, of tuatara sphenodon punctatus. J Zool 263:77–87.</w:t>
       </w:r>
@@ -1623,8 +2617,8 @@
       <w:pPr>
         <w:pStyle w:val="Bibliography"/>
       </w:pPr>
-      <w:bookmarkStart w:id="87" w:name="ref-nilsson1993"/>
-      <w:bookmarkEnd w:id="86"/>
+      <w:bookmarkStart w:id="238" w:name="ref-nilsson1993"/>
+      <w:bookmarkEnd w:id="237"/>
       <w:r>
         <w:t>Nilsson, J. ‐Å., and E. Svensson. 1993. Causes and consequences of egg mass variation between and within blue tit clutches. J Zool 230:469–481.</w:t>
       </w:r>
@@ -1633,8 +2627,8 @@
       <w:pPr>
         <w:pStyle w:val="Bibliography"/>
       </w:pPr>
-      <w:bookmarkStart w:id="88" w:name="ref-parker1982"/>
-      <w:bookmarkEnd w:id="87"/>
+      <w:bookmarkStart w:id="239" w:name="ref-parker1982"/>
+      <w:bookmarkEnd w:id="238"/>
       <w:r>
         <w:t>Parker, G. A. 1982. Why are there so many tiny sperm? Sperm competition and the maintenance of two sexes. J Theor Biol 96:281–294.</w:t>
       </w:r>
@@ -1643,8 +2637,8 @@
       <w:pPr>
         <w:pStyle w:val="Bibliography"/>
       </w:pPr>
-      <w:bookmarkStart w:id="89" w:name="ref-peig2009"/>
-      <w:bookmarkEnd w:id="88"/>
+      <w:bookmarkStart w:id="240" w:name="ref-peig2009"/>
+      <w:bookmarkEnd w:id="239"/>
       <w:r>
         <w:t>Peig, J., and A. J. Green. 2009. New perspectives for estimating body condition from mass/length data: The scaled mass index as an alternative method. Oikos 118:1883–1891.</w:t>
       </w:r>
@@ -1653,8 +2647,8 @@
       <w:pPr>
         <w:pStyle w:val="Bibliography"/>
       </w:pPr>
-      <w:bookmarkStart w:id="90" w:name="ref-peig2010"/>
-      <w:bookmarkEnd w:id="89"/>
+      <w:bookmarkStart w:id="241" w:name="ref-peig2010"/>
+      <w:bookmarkEnd w:id="240"/>
       <w:r>
         <w:t>Peig, J., and A. J. Green. 2010. The paradigm of body condition: A critical reappraisal of current methods based on mass and length. Funct Ecol 24:1323–1332.</w:t>
       </w:r>
@@ -1663,8 +2657,8 @@
       <w:pPr>
         <w:pStyle w:val="Bibliography"/>
       </w:pPr>
-      <w:bookmarkStart w:id="91" w:name="ref-r2013"/>
-      <w:bookmarkEnd w:id="90"/>
+      <w:bookmarkStart w:id="242" w:name="ref-r2013"/>
+      <w:bookmarkEnd w:id="241"/>
       <w:r>
         <w:t>R Core Team. 2025. R: A language and environment for statistical computing. Vienna, Austria.</w:t>
       </w:r>
@@ -1673,8 +2667,8 @@
       <w:pPr>
         <w:pStyle w:val="Bibliography"/>
       </w:pPr>
-      <w:bookmarkStart w:id="92" w:name="ref-reznick2000"/>
-      <w:bookmarkEnd w:id="91"/>
+      <w:bookmarkStart w:id="243" w:name="ref-reznick2000"/>
+      <w:bookmarkEnd w:id="242"/>
       <w:r>
         <w:t>Reznick, D., L. Nunney, and A. Tessier. 2000. Big houses, big cars, superfleas and the costs of reproduction. Trends Ecol Evol 15:421–425.</w:t>
       </w:r>
@@ -1683,8 +2677,8 @@
       <w:pPr>
         <w:pStyle w:val="Bibliography"/>
       </w:pPr>
-      <w:bookmarkStart w:id="93" w:name="ref-roff1992a"/>
-      <w:bookmarkEnd w:id="92"/>
+      <w:bookmarkStart w:id="244" w:name="ref-roff1992a"/>
+      <w:bookmarkEnd w:id="243"/>
       <w:r>
         <w:t>Roff, D. 1992. Evolution of Life Histories: Theory and Analysis. Chapman &amp; Hall, Inc., New York, NY.</w:t>
       </w:r>
@@ -1693,8 +2687,8 @@
       <w:pPr>
         <w:pStyle w:val="Bibliography"/>
       </w:pPr>
-      <w:bookmarkStart w:id="94" w:name="ref-schindelin2012"/>
-      <w:bookmarkEnd w:id="93"/>
+      <w:bookmarkStart w:id="245" w:name="ref-schindelin2012"/>
+      <w:bookmarkEnd w:id="244"/>
       <w:r>
         <w:t>Schindelin, J., I. Arganda-Carreras, E. Frise, V. Kaynig, M. Longair, T. Pietzsch, S. Preibisch, C. Rueden, S. Saalfeld, B. Schmid, J.-Y. Tinevez, D. J. White, V. Hartenstein, K. Eliceiri, P. Tomancak, and A. Cardona. 2012. Fiji: An open-source platform for biological-image analysis. Nat Methods 9:676–682. Max Planck Institute of Molecular Cell Biology; Genetics, Dresden, Germany.</w:t>
       </w:r>
@@ -1703,8 +2697,8 @@
       <w:pPr>
         <w:pStyle w:val="Bibliography"/>
       </w:pPr>
-      <w:bookmarkStart w:id="95" w:name="ref-seko2006"/>
-      <w:bookmarkEnd w:id="94"/>
+      <w:bookmarkStart w:id="246" w:name="ref-seko2006"/>
+      <w:bookmarkEnd w:id="245"/>
       <w:r>
         <w:t>Seko, T., T. Miyatake, S. Fujioka, and F. Nakasuji. 2006. Genetic and environmental sources of egg size, fecundity and body size in the migrant skipper, parnara guttata guttata (lepidoptera: hesperiidae). Popul Ecol 48:225–232.</w:t>
       </w:r>
@@ -1713,8 +2707,8 @@
       <w:pPr>
         <w:pStyle w:val="Bibliography"/>
       </w:pPr>
-      <w:bookmarkStart w:id="96" w:name="ref-shine1978"/>
-      <w:bookmarkEnd w:id="95"/>
+      <w:bookmarkStart w:id="247" w:name="ref-shine1978"/>
+      <w:bookmarkEnd w:id="246"/>
       <w:r>
         <w:t>Shine, R. 1978. Propagule size and parental care: The “safe harbor” hypothesis. J Theor Biol 75:417–424.</w:t>
       </w:r>
@@ -1723,8 +2717,8 @@
       <w:pPr>
         <w:pStyle w:val="Bibliography"/>
       </w:pPr>
-      <w:bookmarkStart w:id="97" w:name="ref-simpson1951"/>
-      <w:bookmarkEnd w:id="96"/>
+      <w:bookmarkStart w:id="248" w:name="ref-simpson1951"/>
+      <w:bookmarkEnd w:id="247"/>
       <w:r>
         <w:t>Simpson, E. H. 1951. The interpretation of interaction in contingency tables. Journal of the Royal Statistical Society: Series B (Methodological) 13:238–241.</w:t>
       </w:r>
@@ -1733,8 +2727,8 @@
       <w:pPr>
         <w:pStyle w:val="Bibliography"/>
       </w:pPr>
-      <w:bookmarkStart w:id="98" w:name="ref-slagsvold1984"/>
-      <w:bookmarkEnd w:id="97"/>
+      <w:bookmarkStart w:id="249" w:name="ref-slagsvold1984"/>
+      <w:bookmarkEnd w:id="248"/>
       <w:r>
         <w:t>Slagsvold, T., J. Sandvik, G. Rofstad, Ö. Lorentsen, and M. Husby. 1984. On the adaptive value of intraclutch egg-size variation in birds. The Auk 101:685–697.</w:t>
       </w:r>
@@ -1743,8 +2737,8 @@
       <w:pPr>
         <w:pStyle w:val="Bibliography"/>
       </w:pPr>
-      <w:bookmarkStart w:id="99" w:name="ref-smith1974"/>
-      <w:bookmarkEnd w:id="98"/>
+      <w:bookmarkStart w:id="250" w:name="ref-smith1974"/>
+      <w:bookmarkEnd w:id="249"/>
       <w:r>
         <w:t>Smith, C. C., and S. D. Fretwell. 1974. The optimal balance between size and number of offspring. Am Nat 108:499–506.</w:t>
       </w:r>
@@ -1753,8 +2747,8 @@
       <w:pPr>
         <w:pStyle w:val="Bibliography"/>
       </w:pPr>
-      <w:bookmarkStart w:id="100" w:name="ref-staerkle2008"/>
-      <w:bookmarkEnd w:id="99"/>
+      <w:bookmarkStart w:id="251" w:name="ref-staerkle2008"/>
+      <w:bookmarkEnd w:id="250"/>
       <w:r>
         <w:lastRenderedPageBreak/>
         <w:t>Staerkle, M., and M. Kölliker. 2008. Maternal food regurgitation to nymphs in earwigs (</w:t>
@@ -1774,8 +2768,8 @@
       <w:pPr>
         <w:pStyle w:val="Bibliography"/>
       </w:pPr>
-      <w:bookmarkStart w:id="101" w:name="ref-stearns1992"/>
-      <w:bookmarkEnd w:id="100"/>
+      <w:bookmarkStart w:id="252" w:name="ref-stearns1992"/>
+      <w:bookmarkEnd w:id="251"/>
       <w:r>
         <w:t>Stearns, S. C. 1992. The Evolution of Life Histories. Oxford University Press.</w:t>
       </w:r>
@@ -1784,8 +2778,8 @@
       <w:pPr>
         <w:pStyle w:val="Bibliography"/>
       </w:pPr>
-      <w:bookmarkStart w:id="102" w:name="ref-stoffel2017"/>
-      <w:bookmarkEnd w:id="101"/>
+      <w:bookmarkStart w:id="253" w:name="ref-stoffel2017"/>
+      <w:bookmarkEnd w:id="252"/>
       <w:r>
         <w:t>Stoffel, M. A., S. Nakagawa, and H. Schielzeth. 2017. RptR: Repeatability estimation and variance decomposition by generalized linear mixed‐effects models. Methods Ecol Evol 8:1639–1644.</w:t>
       </w:r>
@@ -1794,8 +2788,8 @@
       <w:pPr>
         <w:pStyle w:val="Bibliography"/>
       </w:pPr>
-      <w:bookmarkStart w:id="103" w:name="ref-torres-vila2012"/>
-      <w:bookmarkEnd w:id="102"/>
+      <w:bookmarkStart w:id="254" w:name="ref-torres-vila2012"/>
+      <w:bookmarkEnd w:id="253"/>
       <w:r>
         <w:t xml:space="preserve">Torres-Vila, L., E. Cruces-Caldera, M. Rodrı́guez-Molina, and L. Cauterruccio. 2012. Host plant selects for egg size in the moth lobesia botrana: Integrating reproductive and ecological trade-offs is not a simple matter. Pp. 145–167 </w:t>
       </w:r>
@@ -1814,8 +2808,8 @@
       <w:pPr>
         <w:pStyle w:val="Bibliography"/>
       </w:pPr>
-      <w:bookmarkStart w:id="104" w:name="ref-tourneur2018"/>
-      <w:bookmarkEnd w:id="103"/>
+      <w:bookmarkStart w:id="255" w:name="ref-tourneur2018"/>
+      <w:bookmarkEnd w:id="254"/>
       <w:r>
         <w:t xml:space="preserve">Tourneur, J.-C. 2018. Factors affecting the egg-laying pattern of </w:t>
       </w:r>
@@ -1834,8 +2828,8 @@
       <w:pPr>
         <w:pStyle w:val="Bibliography"/>
       </w:pPr>
-      <w:bookmarkStart w:id="105" w:name="ref-tourneur1992"/>
-      <w:bookmarkEnd w:id="104"/>
+      <w:bookmarkStart w:id="256" w:name="ref-tourneur1992"/>
+      <w:bookmarkEnd w:id="255"/>
       <w:r>
         <w:t xml:space="preserve">Tourneur, J.-C., and J. Gingras. 1992. Egg laying in a northeastern North American (montréal, québec) population of </w:t>
       </w:r>
@@ -1854,8 +2848,8 @@
       <w:pPr>
         <w:pStyle w:val="Bibliography"/>
       </w:pPr>
-      <w:bookmarkStart w:id="106" w:name="ref-vannoordwijk1986"/>
-      <w:bookmarkEnd w:id="105"/>
+      <w:bookmarkStart w:id="257" w:name="ref-vannoordwijk1986"/>
+      <w:bookmarkEnd w:id="256"/>
       <w:r>
         <w:t>Van Noordwijk, A. J., and G. de Jong. 1986. Acquisition and allocation of resources: Their influence on variation in life history tactics. Am Nat 128:137–142.</w:t>
       </w:r>
@@ -1864,8 +2858,8 @@
       <w:pPr>
         <w:pStyle w:val="Bibliography"/>
       </w:pPr>
-      <w:bookmarkStart w:id="107" w:name="ref-vehtari2017"/>
-      <w:bookmarkEnd w:id="106"/>
+      <w:bookmarkStart w:id="258" w:name="ref-vehtari2017"/>
+      <w:bookmarkEnd w:id="257"/>
       <w:r>
         <w:t>Vehtari, A., A. Gelman, and J. Gabry. 2017. Practical Bayesian model evaluation using leave-one-out cross-validation and WAIC. Statistics and Computing 27:1413–1432.</w:t>
       </w:r>
@@ -1874,8 +2868,8 @@
       <w:pPr>
         <w:pStyle w:val="Bibliography"/>
       </w:pPr>
-      <w:bookmarkStart w:id="108" w:name="ref-williams1994"/>
-      <w:bookmarkEnd w:id="107"/>
+      <w:bookmarkStart w:id="259" w:name="ref-williams1994"/>
+      <w:bookmarkEnd w:id="258"/>
       <w:r>
         <w:t>Williams, T. D. 1994. Intraspecific variation in egg size and egg composition in birds: Effects on offspring fitness. Biol Rev Camb Philos Soc 69:35–59.</w:t>
       </w:r>
@@ -1884,8 +2878,8 @@
       <w:pPr>
         <w:pStyle w:val="Bibliography"/>
       </w:pPr>
-      <w:bookmarkStart w:id="109" w:name="ref-winkler1987"/>
-      <w:bookmarkEnd w:id="108"/>
+      <w:bookmarkStart w:id="260" w:name="ref-winkler1987"/>
+      <w:bookmarkEnd w:id="259"/>
       <w:r>
         <w:t>Winkler, D. W., and K. Wallin. 1987. Offspring size and number: A life history model linking effort per offspring and total effort. Am Nat 129:708–720.</w:t>
       </w:r>
@@ -1894,8 +2888,8 @@
       <w:pPr>
         <w:pStyle w:val="Bibliography"/>
       </w:pPr>
-      <w:bookmarkStart w:id="110" w:name="ref-yanagi2006"/>
-      <w:bookmarkEnd w:id="109"/>
+      <w:bookmarkStart w:id="261" w:name="ref-yanagi2006"/>
+      <w:bookmarkEnd w:id="260"/>
       <w:r>
         <w:t>Yanagi, S., T. Oikawa, and T. Miyatake. 2006. Heritability and genetic correlation estimates for egg size and number in callosobruchus chinensis (coleoptera: bruchidae). Ann Entomol Soc Am 99:364–368.</w:t>
       </w:r>
@@ -1904,14 +2898,14 @@
       <w:pPr>
         <w:pStyle w:val="Bibliography"/>
       </w:pPr>
-      <w:bookmarkStart w:id="111" w:name="ref-yosef2008"/>
-      <w:bookmarkEnd w:id="110"/>
+      <w:bookmarkStart w:id="262" w:name="ref-yosef2008"/>
+      <w:bookmarkEnd w:id="261"/>
       <w:r>
         <w:t>Yosef, R., and P. Zduniak. 2008. Variation in clutch size, egg size variability and reproductive output in the desert finch (rhodospiza obsoleta). J Arid Environ 72:1631–1635.</w:t>
       </w:r>
     </w:p>
-    <w:bookmarkEnd w:id="67"/>
-    <w:bookmarkEnd w:id="111"/>
+    <w:bookmarkEnd w:id="218"/>
+    <w:bookmarkEnd w:id="262"/>
     <w:p>
       <w:pPr>
         <w:sectPr>
@@ -1951,7 +2945,7 @@
               <w:pStyle w:val="Compact"/>
               <w:jc w:val="center"/>
             </w:pPr>
-            <w:bookmarkStart w:id="112" w:name="fig-one"/>
+            <w:bookmarkStart w:id="263" w:name="fig-one"/>
             <w:r>
               <w:rPr>
                 <w:noProof/>
@@ -2004,7 +2998,7 @@
               <w:pStyle w:val="ImageCaption"/>
               <w:spacing w:before="200"/>
             </w:pPr>
-            <w:bookmarkStart w:id="113" w:name="_Hlk219273106"/>
+            <w:bookmarkStart w:id="264" w:name="_Hlk219273106"/>
             <w:r>
               <w:t>Figure 1: Mean egg perimeter (mm) plotted against clutch size for the first (salmon) and second (blue) clutches of n = 42 female European earwigs (</w:t>
             </w:r>
@@ -2018,10 +3012,10 @@
             <w:r>
               <w:t>). Data are raw values.</w:t>
             </w:r>
-            <w:bookmarkEnd w:id="113"/>
+            <w:bookmarkEnd w:id="264"/>
           </w:p>
         </w:tc>
-        <w:bookmarkEnd w:id="112"/>
+        <w:bookmarkEnd w:id="263"/>
       </w:tr>
     </w:tbl>
     <w:p>
@@ -2052,7 +3046,7 @@
               <w:pStyle w:val="Compact"/>
               <w:jc w:val="center"/>
             </w:pPr>
-            <w:bookmarkStart w:id="114" w:name="fig-two"/>
+            <w:bookmarkStart w:id="265" w:name="fig-two"/>
             <w:r>
               <w:rPr>
                 <w:noProof/>
@@ -2105,7 +3099,7 @@
               <w:pStyle w:val="ImageCaption"/>
               <w:spacing w:before="200"/>
             </w:pPr>
-            <w:bookmarkStart w:id="115" w:name="_Hlk219273123"/>
+            <w:bookmarkStart w:id="266" w:name="_Hlk219273123"/>
             <w:r>
               <w:lastRenderedPageBreak/>
               <w:t>Figure 2: (a) Among and (b) within-female egg size variation in the first and second clutches of n = 42 female European earwigs (</w:t>
@@ -2120,12 +3114,12 @@
             <w:r>
               <w:t>).</w:t>
             </w:r>
-            <w:bookmarkEnd w:id="115"/>
+            <w:bookmarkEnd w:id="266"/>
           </w:p>
         </w:tc>
-        <w:bookmarkEnd w:id="114"/>
+        <w:bookmarkEnd w:id="265"/>
       </w:tr>
-      <w:bookmarkEnd w:id="65"/>
+      <w:bookmarkEnd w:id="216"/>
     </w:tbl>
     <w:p/>
     <w:sectPr>
@@ -3539,7 +4533,6 @@
   <w:style w:type="character" w:default="1" w:styleId="DefaultParagraphFont">
     <w:name w:val="Default Paragraph Font"/>
     <w:uiPriority w:val="1"/>
-    <w:semiHidden/>
     <w:unhideWhenUsed/>
   </w:style>
   <w:style w:type="table" w:default="1" w:styleId="TableNormal">

</xml_diff>